<commit_message>
Documentos validados al 28 de abril 2026
</commit_message>
<xml_diff>
--- a/PIPERLINE.docx
+++ b/PIPERLINE.docx
@@ -38,7 +38,21 @@
           <w:bCs/>
         </w:rPr>
         <w:tab/>
-        <w:t>28/abril/2026</w:t>
+        <w:t>2</w:t>
+      </w:r>
+      <w:r>
+        <w:rPr>
+          <w:b/>
+          <w:bCs/>
+        </w:rPr>
+        <w:t>9</w:t>
+      </w:r>
+      <w:r>
+        <w:rPr>
+          <w:b/>
+          <w:bCs/>
+        </w:rPr>
+        <w:t>/abril/2026</w:t>
       </w:r>
     </w:p>
     <w:p>
@@ -59,7 +73,17 @@
         <w:spacing w:after="0" w:line="240" w:lineRule="auto"/>
       </w:pPr>
       <w:r>
-        <w:t>Cambio de aplicación (</w:t>
+        <w:t xml:space="preserve">Cambio de </w:t>
+      </w:r>
+      <w:r>
+        <w:rPr>
+          <w:b/>
+          <w:bCs/>
+        </w:rPr>
+        <w:t>aplicación</w:t>
+      </w:r>
+      <w:r>
+        <w:t xml:space="preserve"> (</w:t>
       </w:r>
       <w:proofErr w:type="spellStart"/>
       <w:r>
@@ -80,742 +104,71 @@
         <w:spacing w:after="0" w:line="240" w:lineRule="auto"/>
       </w:pPr>
       <w:r>
-        <w:t>Cambio de infraestructura (por ejemplo: cambiar tipo de instancia, agregar balanceador, etc.)</w:t>
-      </w:r>
-    </w:p>
-    <w:p>
-      <w:pPr>
-        <w:spacing w:after="0" w:line="240" w:lineRule="auto"/>
-      </w:pPr>
-    </w:p>
-    <w:p>
-      <w:pPr>
-        <w:spacing w:after="0" w:line="240" w:lineRule="auto"/>
-      </w:pPr>
-      <w:r>
-        <w:t>Para el ejercici</w:t>
-      </w:r>
-      <w:r>
-        <w:t xml:space="preserve">o tomaremos </w:t>
-      </w:r>
-      <w:r>
-        <w:t xml:space="preserve"> </w:t>
-      </w:r>
-    </w:p>
-    <w:p>
-      <w:pPr>
-        <w:spacing w:after="0" w:line="240" w:lineRule="auto"/>
-      </w:pPr>
-      <w:r>
-        <w:tab/>
-        <w:t>Cambios en aplicaciones</w:t>
-      </w:r>
-      <w:r>
-        <w:t>, para eso c</w:t>
-      </w:r>
-      <w:r>
-        <w:t xml:space="preserve">reamos un archivo </w:t>
-      </w:r>
-      <w:proofErr w:type="spellStart"/>
-      <w:r>
-        <w:rPr>
-          <w:b/>
-          <w:bCs/>
-        </w:rPr>
-        <w:t>index.php</w:t>
-      </w:r>
-      <w:proofErr w:type="spellEnd"/>
-      <w:r>
-        <w:t xml:space="preserve">, con el siguiente contenido </w:t>
-      </w:r>
-    </w:p>
-    <w:p>
-      <w:pPr>
-        <w:spacing w:after="0" w:line="240" w:lineRule="auto"/>
-        <w:ind w:left="708"/>
+        <w:t xml:space="preserve">Cambio de </w:t>
+      </w:r>
+      <w:r>
+        <w:rPr>
+          <w:b/>
+          <w:bCs/>
+        </w:rPr>
+        <w:t>infraestructura</w:t>
+      </w:r>
+      <w:r>
+        <w:t xml:space="preserve"> (por ejemplo: cambiar tipo de instancia, agregar balanceador, etc.)</w:t>
+      </w:r>
+    </w:p>
+    <w:p>
+      <w:pPr>
+        <w:spacing w:after="0" w:line="240" w:lineRule="auto"/>
+      </w:pPr>
+    </w:p>
+    <w:p>
+      <w:pPr>
+        <w:spacing w:after="0" w:line="240" w:lineRule="auto"/>
+      </w:pPr>
+      <w:r>
+        <w:t xml:space="preserve">Para el ejercicio tomaremos  </w:t>
+      </w:r>
+    </w:p>
+    <w:p>
+      <w:pPr>
+        <w:spacing w:after="0" w:line="240" w:lineRule="auto"/>
         <w:rPr>
           <w:i/>
           <w:iCs/>
         </w:rPr>
       </w:pPr>
       <w:r>
-        <w:rPr>
-          <w:i/>
-          <w:iCs/>
-        </w:rPr>
-        <w:t>&lt;?</w:t>
-      </w:r>
-      <w:proofErr w:type="spellStart"/>
-      <w:r>
-        <w:rPr>
-          <w:i/>
-          <w:iCs/>
-        </w:rPr>
-        <w:t>php</w:t>
-      </w:r>
-      <w:proofErr w:type="spellEnd"/>
-      <w:r>
-        <w:rPr>
-          <w:i/>
-          <w:iCs/>
-        </w:rPr>
-        <w:br/>
-        <w:t>$</w:t>
-      </w:r>
-      <w:proofErr w:type="spellStart"/>
-      <w:r>
-        <w:rPr>
-          <w:i/>
-          <w:iCs/>
-        </w:rPr>
-        <w:t>conn</w:t>
-      </w:r>
-      <w:proofErr w:type="spellEnd"/>
-      <w:r>
-        <w:rPr>
-          <w:i/>
-          <w:iCs/>
-        </w:rPr>
-        <w:t xml:space="preserve"> = new </w:t>
-      </w:r>
-      <w:proofErr w:type="spellStart"/>
-      <w:r>
-        <w:rPr>
-          <w:i/>
-          <w:iCs/>
-        </w:rPr>
-        <w:t>mysqli</w:t>
-      </w:r>
-      <w:proofErr w:type="spellEnd"/>
-      <w:r>
-        <w:rPr>
-          <w:i/>
-          <w:iCs/>
-        </w:rPr>
-        <w:t>("ENDPOINT_RDS", "</w:t>
-      </w:r>
-      <w:proofErr w:type="spellStart"/>
-      <w:r>
-        <w:rPr>
-          <w:i/>
-          <w:iCs/>
-        </w:rPr>
-        <w:t>admin</w:t>
-      </w:r>
-      <w:proofErr w:type="spellEnd"/>
-      <w:r>
-        <w:rPr>
-          <w:i/>
-          <w:iCs/>
-        </w:rPr>
-        <w:t>", "</w:t>
-      </w:r>
-      <w:proofErr w:type="spellStart"/>
-      <w:r>
-        <w:rPr>
-          <w:i/>
-          <w:iCs/>
-        </w:rPr>
-        <w:t>password</w:t>
-      </w:r>
-      <w:proofErr w:type="spellEnd"/>
-      <w:r>
-        <w:rPr>
-          <w:i/>
-          <w:iCs/>
-        </w:rPr>
-        <w:t>", "</w:t>
-      </w:r>
-      <w:proofErr w:type="spellStart"/>
-      <w:r>
-        <w:rPr>
-          <w:i/>
-          <w:iCs/>
-        </w:rPr>
-        <w:t>tu_db</w:t>
-      </w:r>
-      <w:proofErr w:type="spellEnd"/>
-      <w:r>
-        <w:rPr>
-          <w:i/>
-          <w:iCs/>
-        </w:rPr>
-        <w:t>");</w:t>
-      </w:r>
-      <w:r>
-        <w:rPr>
-          <w:i/>
-          <w:iCs/>
-        </w:rPr>
-        <w:br/>
-      </w:r>
-      <w:r>
-        <w:rPr>
-          <w:i/>
-          <w:iCs/>
-        </w:rPr>
-        <w:br/>
-        <w:t>$</w:t>
-      </w:r>
-      <w:proofErr w:type="spellStart"/>
-      <w:r>
-        <w:rPr>
-          <w:i/>
-          <w:iCs/>
-        </w:rPr>
-        <w:t>sql</w:t>
-      </w:r>
-      <w:proofErr w:type="spellEnd"/>
-      <w:r>
-        <w:rPr>
-          <w:i/>
-          <w:iCs/>
-        </w:rPr>
-        <w:t xml:space="preserve"> = "SELECT </w:t>
-      </w:r>
-      <w:r>
-        <w:rPr>
-          <w:i/>
-          <w:iCs/>
-        </w:rPr>
-        <w:br/>
-        <w:t xml:space="preserve">    </w:t>
-      </w:r>
-      <w:proofErr w:type="spellStart"/>
-      <w:r>
-        <w:rPr>
-          <w:i/>
-          <w:iCs/>
-        </w:rPr>
-        <w:t>e.id_envio</w:t>
-      </w:r>
-      <w:proofErr w:type="spellEnd"/>
-      <w:r>
-        <w:rPr>
-          <w:i/>
-          <w:iCs/>
-        </w:rPr>
-        <w:t>,</w:t>
-      </w:r>
-      <w:r>
-        <w:rPr>
-          <w:i/>
-          <w:iCs/>
-        </w:rPr>
-        <w:br/>
-        <w:t xml:space="preserve">    </w:t>
-      </w:r>
-      <w:proofErr w:type="spellStart"/>
-      <w:r>
-        <w:rPr>
-          <w:i/>
-          <w:iCs/>
-        </w:rPr>
-        <w:t>c.nombre</w:t>
-      </w:r>
-      <w:proofErr w:type="spellEnd"/>
-      <w:r>
-        <w:rPr>
-          <w:i/>
-          <w:iCs/>
-        </w:rPr>
-        <w:t xml:space="preserve"> AS cliente,</w:t>
-      </w:r>
-      <w:r>
-        <w:rPr>
-          <w:i/>
-          <w:iCs/>
-        </w:rPr>
-        <w:br/>
-        <w:t xml:space="preserve">    </w:t>
-      </w:r>
-      <w:proofErr w:type="spellStart"/>
-      <w:r>
-        <w:rPr>
-          <w:i/>
-          <w:iCs/>
-        </w:rPr>
-        <w:t>v.tipo</w:t>
-      </w:r>
-      <w:proofErr w:type="spellEnd"/>
-      <w:r>
-        <w:rPr>
-          <w:i/>
-          <w:iCs/>
-        </w:rPr>
-        <w:t xml:space="preserve"> AS </w:t>
-      </w:r>
-      <w:proofErr w:type="spellStart"/>
-      <w:r>
-        <w:rPr>
-          <w:i/>
-          <w:iCs/>
-        </w:rPr>
-        <w:t>vehiculo</w:t>
-      </w:r>
-      <w:proofErr w:type="spellEnd"/>
-      <w:r>
-        <w:rPr>
-          <w:i/>
-          <w:iCs/>
-        </w:rPr>
-        <w:t>,</w:t>
-      </w:r>
-      <w:r>
-        <w:rPr>
-          <w:i/>
-          <w:iCs/>
-        </w:rPr>
-        <w:br/>
-        <w:t xml:space="preserve">    </w:t>
-      </w:r>
-      <w:proofErr w:type="spellStart"/>
-      <w:r>
-        <w:rPr>
-          <w:i/>
-          <w:iCs/>
-        </w:rPr>
-        <w:t>r.origen</w:t>
-      </w:r>
-      <w:proofErr w:type="spellEnd"/>
-      <w:r>
-        <w:rPr>
-          <w:i/>
-          <w:iCs/>
-        </w:rPr>
-        <w:t>,</w:t>
-      </w:r>
-      <w:r>
-        <w:rPr>
-          <w:i/>
-          <w:iCs/>
-        </w:rPr>
-        <w:br/>
-        <w:t xml:space="preserve">    </w:t>
-      </w:r>
-      <w:proofErr w:type="spellStart"/>
-      <w:r>
-        <w:rPr>
-          <w:i/>
-          <w:iCs/>
-        </w:rPr>
-        <w:t>r.destino</w:t>
-      </w:r>
-      <w:proofErr w:type="spellEnd"/>
-      <w:r>
-        <w:rPr>
-          <w:i/>
-          <w:iCs/>
-        </w:rPr>
-        <w:t>,</w:t>
-      </w:r>
-      <w:r>
-        <w:rPr>
-          <w:i/>
-          <w:iCs/>
-        </w:rPr>
-        <w:br/>
-        <w:t xml:space="preserve">    </w:t>
-      </w:r>
-      <w:proofErr w:type="spellStart"/>
-      <w:r>
-        <w:rPr>
-          <w:i/>
-          <w:iCs/>
-        </w:rPr>
-        <w:t>e.estado</w:t>
-      </w:r>
-      <w:proofErr w:type="spellEnd"/>
-      <w:r>
-        <w:rPr>
-          <w:i/>
-          <w:iCs/>
-        </w:rPr>
-        <w:br/>
-        <w:t xml:space="preserve">FROM </w:t>
-      </w:r>
-      <w:proofErr w:type="spellStart"/>
-      <w:r>
-        <w:rPr>
-          <w:i/>
-          <w:iCs/>
-        </w:rPr>
-        <w:t>envios</w:t>
-      </w:r>
-      <w:proofErr w:type="spellEnd"/>
-      <w:r>
-        <w:rPr>
-          <w:i/>
-          <w:iCs/>
-        </w:rPr>
-        <w:t xml:space="preserve"> e</w:t>
-      </w:r>
-      <w:r>
-        <w:rPr>
-          <w:i/>
-          <w:iCs/>
-        </w:rPr>
-        <w:br/>
-        <w:t xml:space="preserve">JOIN clientes c ON </w:t>
-      </w:r>
-      <w:proofErr w:type="spellStart"/>
-      <w:r>
-        <w:rPr>
-          <w:i/>
-          <w:iCs/>
-        </w:rPr>
-        <w:t>e.id_cliente</w:t>
-      </w:r>
-      <w:proofErr w:type="spellEnd"/>
-      <w:r>
-        <w:rPr>
-          <w:i/>
-          <w:iCs/>
-        </w:rPr>
-        <w:t xml:space="preserve"> = </w:t>
-      </w:r>
-      <w:proofErr w:type="spellStart"/>
-      <w:r>
-        <w:rPr>
-          <w:i/>
-          <w:iCs/>
-        </w:rPr>
-        <w:t>c.id_cliente</w:t>
-      </w:r>
-      <w:proofErr w:type="spellEnd"/>
-      <w:r>
-        <w:rPr>
-          <w:i/>
-          <w:iCs/>
-        </w:rPr>
-        <w:br/>
-        <w:t xml:space="preserve">JOIN </w:t>
-      </w:r>
-      <w:proofErr w:type="spellStart"/>
-      <w:r>
-        <w:rPr>
-          <w:i/>
-          <w:iCs/>
-        </w:rPr>
-        <w:t>vehiculos</w:t>
-      </w:r>
-      <w:proofErr w:type="spellEnd"/>
-      <w:r>
-        <w:rPr>
-          <w:i/>
-          <w:iCs/>
-        </w:rPr>
-        <w:t xml:space="preserve"> v ON </w:t>
-      </w:r>
-      <w:proofErr w:type="spellStart"/>
-      <w:r>
-        <w:rPr>
-          <w:i/>
-          <w:iCs/>
-        </w:rPr>
-        <w:t>e.id_vehiculo</w:t>
-      </w:r>
-      <w:proofErr w:type="spellEnd"/>
-      <w:r>
-        <w:rPr>
-          <w:i/>
-          <w:iCs/>
-        </w:rPr>
-        <w:t xml:space="preserve"> = </w:t>
-      </w:r>
-      <w:proofErr w:type="spellStart"/>
-      <w:r>
-        <w:rPr>
-          <w:i/>
-          <w:iCs/>
-        </w:rPr>
-        <w:t>v.id_vehiculo</w:t>
-      </w:r>
-      <w:proofErr w:type="spellEnd"/>
-      <w:r>
-        <w:rPr>
-          <w:i/>
-          <w:iCs/>
-        </w:rPr>
-        <w:br/>
-        <w:t xml:space="preserve">JOIN rutas r ON </w:t>
-      </w:r>
-      <w:proofErr w:type="spellStart"/>
-      <w:r>
-        <w:rPr>
-          <w:i/>
-          <w:iCs/>
-        </w:rPr>
-        <w:t>e.id_ruta</w:t>
-      </w:r>
-      <w:proofErr w:type="spellEnd"/>
-      <w:r>
-        <w:rPr>
-          <w:i/>
-          <w:iCs/>
-        </w:rPr>
-        <w:t xml:space="preserve"> = </w:t>
-      </w:r>
-      <w:proofErr w:type="spellStart"/>
-      <w:r>
-        <w:rPr>
-          <w:i/>
-          <w:iCs/>
-        </w:rPr>
-        <w:t>r.id_ruta</w:t>
-      </w:r>
-      <w:proofErr w:type="spellEnd"/>
-      <w:r>
-        <w:rPr>
-          <w:i/>
-          <w:iCs/>
-        </w:rPr>
-        <w:t>;";</w:t>
-      </w:r>
-      <w:r>
-        <w:rPr>
-          <w:i/>
-          <w:iCs/>
-        </w:rPr>
-        <w:br/>
-      </w:r>
-      <w:r>
-        <w:rPr>
-          <w:i/>
-          <w:iCs/>
-        </w:rPr>
-        <w:br/>
-        <w:t>$</w:t>
-      </w:r>
-      <w:proofErr w:type="spellStart"/>
-      <w:r>
-        <w:rPr>
-          <w:i/>
-          <w:iCs/>
-        </w:rPr>
-        <w:t>result</w:t>
-      </w:r>
-      <w:proofErr w:type="spellEnd"/>
-      <w:r>
-        <w:rPr>
-          <w:i/>
-          <w:iCs/>
-        </w:rPr>
-        <w:t xml:space="preserve"> = $</w:t>
-      </w:r>
-      <w:proofErr w:type="spellStart"/>
-      <w:r>
-        <w:rPr>
-          <w:i/>
-          <w:iCs/>
-        </w:rPr>
-        <w:t>conn</w:t>
-      </w:r>
-      <w:proofErr w:type="spellEnd"/>
-      <w:r>
-        <w:rPr>
-          <w:i/>
-          <w:iCs/>
-        </w:rPr>
-        <w:t>-&gt;</w:t>
-      </w:r>
-      <w:proofErr w:type="spellStart"/>
-      <w:r>
-        <w:rPr>
-          <w:i/>
-          <w:iCs/>
-        </w:rPr>
-        <w:t>query</w:t>
-      </w:r>
-      <w:proofErr w:type="spellEnd"/>
-      <w:r>
-        <w:rPr>
-          <w:i/>
-          <w:iCs/>
-        </w:rPr>
-        <w:t>($</w:t>
-      </w:r>
-      <w:proofErr w:type="spellStart"/>
-      <w:r>
-        <w:rPr>
-          <w:i/>
-          <w:iCs/>
-        </w:rPr>
-        <w:t>sql</w:t>
-      </w:r>
-      <w:proofErr w:type="spellEnd"/>
-      <w:r>
-        <w:rPr>
-          <w:i/>
-          <w:iCs/>
-        </w:rPr>
-        <w:t>);</w:t>
-      </w:r>
-      <w:r>
-        <w:rPr>
-          <w:i/>
-          <w:iCs/>
-        </w:rPr>
-        <w:br/>
-      </w:r>
-      <w:r>
-        <w:rPr>
-          <w:i/>
-          <w:iCs/>
-        </w:rPr>
-        <w:br/>
-      </w:r>
-      <w:proofErr w:type="spellStart"/>
-      <w:r>
-        <w:rPr>
-          <w:i/>
-          <w:iCs/>
-        </w:rPr>
-        <w:t>while</w:t>
-      </w:r>
-      <w:proofErr w:type="spellEnd"/>
-      <w:r>
-        <w:rPr>
-          <w:i/>
-          <w:iCs/>
-        </w:rPr>
-        <w:t>($</w:t>
-      </w:r>
-      <w:proofErr w:type="spellStart"/>
-      <w:r>
-        <w:rPr>
-          <w:i/>
-          <w:iCs/>
-        </w:rPr>
-        <w:t>row</w:t>
-      </w:r>
-      <w:proofErr w:type="spellEnd"/>
-      <w:r>
-        <w:rPr>
-          <w:i/>
-          <w:iCs/>
-        </w:rPr>
-        <w:t xml:space="preserve"> = $</w:t>
-      </w:r>
-      <w:proofErr w:type="spellStart"/>
-      <w:r>
-        <w:rPr>
-          <w:i/>
-          <w:iCs/>
-        </w:rPr>
-        <w:t>result</w:t>
-      </w:r>
-      <w:proofErr w:type="spellEnd"/>
-      <w:r>
-        <w:rPr>
-          <w:i/>
-          <w:iCs/>
-        </w:rPr>
-        <w:t>-&gt;</w:t>
-      </w:r>
-      <w:proofErr w:type="spellStart"/>
-      <w:r>
-        <w:rPr>
-          <w:i/>
-          <w:iCs/>
-        </w:rPr>
-        <w:t>fetch_assoc</w:t>
-      </w:r>
-      <w:proofErr w:type="spellEnd"/>
-      <w:r>
-        <w:rPr>
-          <w:i/>
-          <w:iCs/>
-        </w:rPr>
-        <w:t>()) {</w:t>
-      </w:r>
-      <w:r>
-        <w:rPr>
-          <w:i/>
-          <w:iCs/>
-        </w:rPr>
-        <w:br/>
-        <w:t xml:space="preserve">    echo $</w:t>
-      </w:r>
-      <w:proofErr w:type="spellStart"/>
-      <w:r>
-        <w:rPr>
-          <w:i/>
-          <w:iCs/>
-        </w:rPr>
-        <w:t>row</w:t>
-      </w:r>
-      <w:proofErr w:type="spellEnd"/>
-      <w:r>
-        <w:rPr>
-          <w:i/>
-          <w:iCs/>
-        </w:rPr>
-        <w:t>["cliente"] . " - " . $</w:t>
-      </w:r>
-      <w:proofErr w:type="spellStart"/>
-      <w:r>
-        <w:rPr>
-          <w:i/>
-          <w:iCs/>
-        </w:rPr>
-        <w:t>row</w:t>
-      </w:r>
-      <w:proofErr w:type="spellEnd"/>
-      <w:r>
-        <w:rPr>
-          <w:i/>
-          <w:iCs/>
-        </w:rPr>
-        <w:t>["estado"</w:t>
-      </w:r>
-      <w:proofErr w:type="gramStart"/>
-      <w:r>
-        <w:rPr>
-          <w:i/>
-          <w:iCs/>
-        </w:rPr>
-        <w:t>] .</w:t>
-      </w:r>
-      <w:proofErr w:type="gramEnd"/>
-      <w:r>
-        <w:rPr>
-          <w:i/>
-          <w:iCs/>
-        </w:rPr>
-        <w:t xml:space="preserve"> "&lt;</w:t>
-      </w:r>
-      <w:proofErr w:type="spellStart"/>
-      <w:r>
-        <w:rPr>
-          <w:i/>
-          <w:iCs/>
-        </w:rPr>
-        <w:t>br</w:t>
-      </w:r>
-      <w:proofErr w:type="spellEnd"/>
-      <w:r>
-        <w:rPr>
-          <w:i/>
-          <w:iCs/>
-        </w:rPr>
-        <w:t>&gt;";</w:t>
-      </w:r>
-      <w:r>
-        <w:rPr>
-          <w:i/>
-          <w:iCs/>
-        </w:rPr>
-        <w:br/>
-        <w:t>}</w:t>
-      </w:r>
-      <w:r>
-        <w:rPr>
-          <w:i/>
-          <w:iCs/>
-        </w:rPr>
-        <w:br/>
-        <w:t>?&gt;</w:t>
+        <w:tab/>
+        <w:t xml:space="preserve">Cambios en </w:t>
+      </w:r>
+      <w:r>
+        <w:rPr>
+          <w:b/>
+          <w:bCs/>
+        </w:rPr>
+        <w:t>aplicaciones</w:t>
+      </w:r>
+      <w:r>
+        <w:t>, para eso c</w:t>
+      </w:r>
+      <w:r>
+        <w:t xml:space="preserve">reamos un archivo </w:t>
+      </w:r>
+      <w:proofErr w:type="spellStart"/>
+      <w:r>
+        <w:rPr>
+          <w:b/>
+          <w:bCs/>
+        </w:rPr>
+        <w:t>index.php</w:t>
+      </w:r>
+      <w:proofErr w:type="spellEnd"/>
+      <w:r>
+        <w:t>.</w:t>
+      </w:r>
+      <w:r>
+        <w:t xml:space="preserve"> </w:t>
       </w:r>
     </w:p>
     <w:p>
@@ -865,16 +218,25 @@
         <w:ind w:left="708" w:firstLine="708"/>
       </w:pPr>
       <w:r>
+        <w:rPr>
+          <w:highlight w:val="green"/>
+        </w:rPr>
         <w:t xml:space="preserve">WHERE </w:t>
       </w:r>
       <w:proofErr w:type="spellStart"/>
       <w:proofErr w:type="gramStart"/>
       <w:r>
+        <w:rPr>
+          <w:highlight w:val="green"/>
+        </w:rPr>
         <w:t>e.estado</w:t>
       </w:r>
       <w:proofErr w:type="spellEnd"/>
       <w:proofErr w:type="gramEnd"/>
       <w:r>
+        <w:rPr>
+          <w:highlight w:val="green"/>
+        </w:rPr>
         <w:t xml:space="preserve"> = 'ENTREGADO'</w:t>
       </w:r>
     </w:p>
@@ -903,14 +265,9 @@
       <w:r>
         <w:t xml:space="preserve"> </w:t>
       </w:r>
-      <w:proofErr w:type="spellStart"/>
       <w:proofErr w:type="gramStart"/>
       <w:r>
-        <w:t>add</w:t>
-      </w:r>
-      <w:proofErr w:type="spellEnd"/>
-      <w:r>
-        <w:t xml:space="preserve"> .</w:t>
+        <w:t>add .</w:t>
       </w:r>
       <w:proofErr w:type="gramEnd"/>
       <w:r>
@@ -1045,7 +402,6 @@
           <w:b/>
           <w:bCs/>
         </w:rPr>
-        <w:lastRenderedPageBreak/>
         <w:t>¿Qué hacer?</w:t>
       </w:r>
       <w:r>
@@ -1229,66 +585,67 @@
       <w:pPr>
         <w:spacing w:after="0"/>
         <w:ind w:left="1416"/>
-      </w:pPr>
-      <w:r>
+        <w:rPr>
+          <w:lang w:val="en-US"/>
+        </w:rPr>
+      </w:pPr>
+      <w:r>
+        <w:rPr>
+          <w:lang w:val="en-US"/>
+        </w:rPr>
         <w:t>Elige:</w:t>
       </w:r>
       <w:r>
+        <w:rPr>
+          <w:lang w:val="en-US"/>
+        </w:rPr>
         <w:br/>
       </w:r>
       <w:r>
         <w:rPr>
           <w:b/>
           <w:bCs/>
-        </w:rPr>
-        <w:t xml:space="preserve">EC2 </w:t>
-      </w:r>
-      <w:proofErr w:type="spellStart"/>
-      <w:r>
-        <w:rPr>
-          <w:b/>
-          <w:bCs/>
-        </w:rPr>
-        <w:t>Instance</w:t>
-      </w:r>
-      <w:proofErr w:type="spellEnd"/>
-      <w:r>
-        <w:rPr>
-          <w:b/>
-          <w:bCs/>
+          <w:lang w:val="en-US"/>
+        </w:rPr>
+        <w:t>EC2 Instance Connect</w:t>
+      </w:r>
+      <w:r>
+        <w:rPr>
+          <w:lang w:val="en-US"/>
         </w:rPr>
         <w:t xml:space="preserve"> </w:t>
       </w:r>
-      <w:proofErr w:type="spellStart"/>
-      <w:r>
-        <w:rPr>
-          <w:b/>
-          <w:bCs/>
+    </w:p>
+    <w:p>
+      <w:pPr>
+        <w:spacing w:after="0" w:line="240" w:lineRule="auto"/>
+        <w:ind w:left="2856"/>
+        <w:rPr>
+          <w:lang w:val="en-US"/>
+        </w:rPr>
+      </w:pPr>
+      <w:proofErr w:type="spellStart"/>
+      <w:r>
+        <w:rPr>
+          <w:lang w:val="en-US"/>
+        </w:rPr>
+        <w:t>Clic</w:t>
+      </w:r>
+      <w:proofErr w:type="spellEnd"/>
+      <w:r>
+        <w:rPr>
+          <w:lang w:val="en-US"/>
+        </w:rPr>
+        <w:t xml:space="preserve"> en </w:t>
+      </w:r>
+      <w:r>
+        <w:rPr>
+          <w:b/>
+          <w:bCs/>
+          <w:lang w:val="en-US"/>
         </w:rPr>
         <w:t>Connect</w:t>
       </w:r>
-      <w:proofErr w:type="spellEnd"/>
-      <w:r>
-        <w:t xml:space="preserve"> </w:t>
-      </w:r>
-    </w:p>
-    <w:p>
-      <w:pPr>
-        <w:spacing w:after="0" w:line="240" w:lineRule="auto"/>
-        <w:ind w:left="2856"/>
-      </w:pPr>
-      <w:r>
-        <w:t xml:space="preserve">Clic en </w:t>
-      </w:r>
-      <w:proofErr w:type="spellStart"/>
-      <w:r>
-        <w:rPr>
-          <w:b/>
-          <w:bCs/>
-        </w:rPr>
-        <w:t>Connect</w:t>
-      </w:r>
-      <w:proofErr w:type="spellEnd"/>
     </w:p>
     <w:p>
       <w:pPr>
@@ -1422,6 +779,7 @@
           <w:iCs/>
           <w:lang w:val="en-US"/>
         </w:rPr>
+        <w:lastRenderedPageBreak/>
         <w:t>Iniciar</w:t>
       </w:r>
       <w:proofErr w:type="spellEnd"/>
@@ -1529,7 +887,12 @@
         <w:ind w:left="708"/>
       </w:pPr>
       <w:r>
+        <w:rPr>
+          <w:lang w:val="en-US"/>
+        </w:rPr>
         <w:tab/>
+      </w:r>
+      <w:r>
         <w:t xml:space="preserve">actualiza </w:t>
       </w:r>
     </w:p>
@@ -1549,6 +912,42 @@
       </w:r>
       <w:proofErr w:type="spellStart"/>
       <w:r>
+        <w:t>yum</w:t>
+      </w:r>
+      <w:proofErr w:type="spellEnd"/>
+      <w:r>
+        <w:t xml:space="preserve"> </w:t>
+      </w:r>
+      <w:proofErr w:type="spellStart"/>
+      <w:r>
+        <w:t>remove</w:t>
+      </w:r>
+      <w:proofErr w:type="spellEnd"/>
+      <w:r>
+        <w:t xml:space="preserve"> </w:t>
+      </w:r>
+      <w:proofErr w:type="spellStart"/>
+      <w:r>
+        <w:t>php</w:t>
+      </w:r>
+      <w:proofErr w:type="spellEnd"/>
+      <w:r>
+        <w:t xml:space="preserve"> -y</w:t>
+      </w:r>
+    </w:p>
+    <w:p>
+      <w:pPr>
+        <w:spacing w:after="0" w:line="240" w:lineRule="auto"/>
+        <w:ind w:left="1416" w:firstLine="708"/>
+      </w:pPr>
+      <w:r>
+        <w:t>--</w:t>
+      </w:r>
+      <w:r>
+        <w:t xml:space="preserve">sudo </w:t>
+      </w:r>
+      <w:proofErr w:type="spellStart"/>
+      <w:r>
         <w:t>amazon</w:t>
       </w:r>
       <w:proofErr w:type="spellEnd"/>
@@ -1680,6 +1079,164 @@
       <w:r>
         <w:t xml:space="preserve"> -y</w:t>
       </w:r>
+    </w:p>
+    <w:p>
+      <w:pPr>
+        <w:spacing w:after="0" w:line="240" w:lineRule="auto"/>
+        <w:ind w:left="1416" w:firstLine="708"/>
+      </w:pPr>
+    </w:p>
+    <w:p>
+      <w:pPr>
+        <w:spacing w:after="0" w:line="240" w:lineRule="auto"/>
+      </w:pPr>
+      <w:r>
+        <w:tab/>
+      </w:r>
+      <w:r>
+        <w:tab/>
+        <w:t>Reiniciar Apache</w:t>
+      </w:r>
+    </w:p>
+    <w:p>
+      <w:pPr>
+        <w:spacing w:after="0" w:line="240" w:lineRule="auto"/>
+        <w:rPr>
+          <w:lang w:val="en-US"/>
+        </w:rPr>
+      </w:pPr>
+      <w:r>
+        <w:tab/>
+      </w:r>
+      <w:r>
+        <w:tab/>
+      </w:r>
+      <w:r>
+        <w:tab/>
+      </w:r>
+      <w:r>
+        <w:rPr>
+          <w:lang w:val="en-US"/>
+        </w:rPr>
+        <w:t>sudo systemctl stop httpd</w:t>
+      </w:r>
+    </w:p>
+    <w:p>
+      <w:pPr>
+        <w:spacing w:after="0" w:line="240" w:lineRule="auto"/>
+        <w:ind w:left="1416" w:firstLine="708"/>
+        <w:rPr>
+          <w:lang w:val="en-US"/>
+        </w:rPr>
+      </w:pPr>
+      <w:r>
+        <w:rPr>
+          <w:lang w:val="en-US"/>
+        </w:rPr>
+        <w:t>sudo pkill httpd</w:t>
+      </w:r>
+    </w:p>
+    <w:p>
+      <w:pPr>
+        <w:spacing w:after="0" w:line="240" w:lineRule="auto"/>
+        <w:ind w:left="1416" w:firstLine="708"/>
+        <w:rPr>
+          <w:lang w:val="en-US"/>
+        </w:rPr>
+      </w:pPr>
+      <w:proofErr w:type="spellStart"/>
+      <w:r>
+        <w:rPr>
+          <w:lang w:val="en-US"/>
+        </w:rPr>
+        <w:t>sudo</w:t>
+      </w:r>
+      <w:proofErr w:type="spellEnd"/>
+      <w:r>
+        <w:rPr>
+          <w:lang w:val="en-US"/>
+        </w:rPr>
+        <w:t xml:space="preserve"> </w:t>
+      </w:r>
+      <w:proofErr w:type="spellStart"/>
+      <w:r>
+        <w:rPr>
+          <w:lang w:val="en-US"/>
+        </w:rPr>
+        <w:t>systemctl</w:t>
+      </w:r>
+      <w:proofErr w:type="spellEnd"/>
+      <w:r>
+        <w:rPr>
+          <w:lang w:val="en-US"/>
+        </w:rPr>
+        <w:t xml:space="preserve"> start httpd</w:t>
+      </w:r>
+    </w:p>
+    <w:p>
+      <w:pPr>
+        <w:spacing w:after="0" w:line="240" w:lineRule="auto"/>
+        <w:rPr>
+          <w:lang w:val="en-US"/>
+        </w:rPr>
+      </w:pPr>
+      <w:r>
+        <w:rPr>
+          <w:lang w:val="en-US"/>
+        </w:rPr>
+        <w:tab/>
+      </w:r>
+      <w:r>
+        <w:rPr>
+          <w:lang w:val="en-US"/>
+        </w:rPr>
+        <w:tab/>
+      </w:r>
+      <w:r>
+        <w:rPr>
+          <w:lang w:val="en-US"/>
+        </w:rPr>
+        <w:tab/>
+      </w:r>
+      <w:proofErr w:type="spellStart"/>
+      <w:r>
+        <w:rPr>
+          <w:lang w:val="en-US"/>
+        </w:rPr>
+        <w:t>php</w:t>
+      </w:r>
+      <w:proofErr w:type="spellEnd"/>
+      <w:r>
+        <w:rPr>
+          <w:lang w:val="en-US"/>
+        </w:rPr>
+        <w:t xml:space="preserve"> -v</w:t>
+      </w:r>
+    </w:p>
+    <w:p>
+      <w:pPr>
+        <w:spacing w:after="0" w:line="240" w:lineRule="auto"/>
+      </w:pPr>
+      <w:r>
+        <w:rPr>
+          <w:lang w:val="en-US"/>
+        </w:rPr>
+        <w:tab/>
+      </w:r>
+      <w:r>
+        <w:rPr>
+          <w:lang w:val="en-US"/>
+        </w:rPr>
+        <w:tab/>
+      </w:r>
+      <w:r>
+        <w:t>tiene que ser PHP 8.XX</w:t>
+      </w:r>
+    </w:p>
+    <w:p>
+      <w:pPr>
+        <w:spacing w:after="0" w:line="240" w:lineRule="auto"/>
+      </w:pPr>
     </w:p>
     <w:p>
       <w:pPr>
@@ -1820,46 +1377,46 @@
     <w:p>
       <w:pPr>
         <w:spacing w:after="0" w:line="240" w:lineRule="auto"/>
+        <w:ind w:left="1416" w:firstLine="708"/>
+      </w:pPr>
+      <w:r>
+        <w:t>nano /</w:t>
+      </w:r>
+      <w:proofErr w:type="spellStart"/>
+      <w:r>
+        <w:t>var</w:t>
+      </w:r>
+      <w:proofErr w:type="spellEnd"/>
+      <w:r>
+        <w:t>/www/</w:t>
+      </w:r>
+      <w:proofErr w:type="spellStart"/>
+      <w:r>
+        <w:t>html</w:t>
+      </w:r>
+      <w:proofErr w:type="spellEnd"/>
+      <w:r>
+        <w:t>/</w:t>
+      </w:r>
+      <w:proofErr w:type="spellStart"/>
+      <w:r>
+        <w:t>index.php</w:t>
+      </w:r>
+      <w:proofErr w:type="spellEnd"/>
+    </w:p>
+    <w:p>
+      <w:pPr>
+        <w:spacing w:after="0" w:line="240" w:lineRule="auto"/>
         <w:ind w:left="1416"/>
       </w:pPr>
       <w:r>
-        <w:t>nano /</w:t>
-      </w:r>
-      <w:proofErr w:type="spellStart"/>
-      <w:r>
-        <w:t>var</w:t>
-      </w:r>
-      <w:proofErr w:type="spellEnd"/>
-      <w:r>
-        <w:t>/www/</w:t>
-      </w:r>
-      <w:proofErr w:type="spellStart"/>
-      <w:r>
-        <w:t>html</w:t>
-      </w:r>
-      <w:proofErr w:type="spellEnd"/>
-      <w:r>
-        <w:t>/</w:t>
-      </w:r>
-      <w:proofErr w:type="spellStart"/>
-      <w:r>
-        <w:t>index.php</w:t>
-      </w:r>
-      <w:proofErr w:type="spellEnd"/>
-    </w:p>
-    <w:p>
-      <w:pPr>
-        <w:spacing w:after="0" w:line="240" w:lineRule="auto"/>
-        <w:ind w:left="1416"/>
-      </w:pPr>
-      <w:r>
         <w:t>Pega esto:</w:t>
       </w:r>
     </w:p>
     <w:p>
       <w:pPr>
         <w:spacing w:after="0" w:line="240" w:lineRule="auto"/>
-        <w:ind w:left="1416"/>
+        <w:ind w:left="2124"/>
       </w:pPr>
       <w:r>
         <w:t>&lt;?</w:t>
@@ -1869,8 +1426,13 @@
         <w:t>php</w:t>
       </w:r>
       <w:proofErr w:type="spellEnd"/>
-      <w:r>
-        <w:br/>
+    </w:p>
+    <w:p>
+      <w:pPr>
+        <w:spacing w:after="0" w:line="240" w:lineRule="auto"/>
+        <w:ind w:left="2124"/>
+      </w:pPr>
+      <w:r>
         <w:t>$</w:t>
       </w:r>
       <w:proofErr w:type="spellStart"/>
@@ -1882,12 +1444,32 @@
         <w:t xml:space="preserve"> = new </w:t>
       </w:r>
       <w:proofErr w:type="spellStart"/>
+      <w:proofErr w:type="gramStart"/>
       <w:r>
         <w:t>mysqli</w:t>
       </w:r>
       <w:proofErr w:type="spellEnd"/>
       <w:r>
-        <w:t>("ENDPOINT_RDS", "</w:t>
+        <w:t>(</w:t>
+      </w:r>
+      <w:proofErr w:type="gramEnd"/>
+    </w:p>
+    <w:p>
+      <w:pPr>
+        <w:spacing w:after="0" w:line="240" w:lineRule="auto"/>
+        <w:ind w:left="2124"/>
+      </w:pPr>
+      <w:r>
+        <w:t xml:space="preserve">    "lab-db.c8x25hqxol6l.us-east-1.rds.amazonaws.com",</w:t>
+      </w:r>
+    </w:p>
+    <w:p>
+      <w:pPr>
+        <w:spacing w:after="0" w:line="240" w:lineRule="auto"/>
+        <w:ind w:left="2124"/>
+      </w:pPr>
+      <w:r>
+        <w:t xml:space="preserve">    "</w:t>
       </w:r>
       <w:proofErr w:type="spellStart"/>
       <w:r>
@@ -1895,41 +1477,183 @@
       </w:r>
       <w:proofErr w:type="spellEnd"/>
       <w:r>
-        <w:t>", "</w:t>
+        <w:t>",</w:t>
+      </w:r>
+    </w:p>
+    <w:p>
+      <w:pPr>
+        <w:spacing w:after="0" w:line="240" w:lineRule="auto"/>
+        <w:ind w:left="2124"/>
+      </w:pPr>
+      <w:r>
+        <w:t xml:space="preserve">    "Admin1234</w:t>
+      </w:r>
+      <w:proofErr w:type="gramStart"/>
+      <w:r>
+        <w:t xml:space="preserve">",   </w:t>
+      </w:r>
+      <w:proofErr w:type="gramEnd"/>
+      <w:r>
+        <w:t xml:space="preserve">   // &lt;-- </w:t>
+      </w:r>
+      <w:proofErr w:type="gramStart"/>
+      <w:r>
+        <w:t xml:space="preserve">tu </w:t>
       </w:r>
       <w:proofErr w:type="spellStart"/>
       <w:r>
         <w:t>password</w:t>
       </w:r>
       <w:proofErr w:type="spellEnd"/>
-      <w:r>
-        <w:t>", "</w:t>
-      </w:r>
-      <w:proofErr w:type="spellStart"/>
-      <w:r>
-        <w:t>tu_db</w:t>
-      </w:r>
-      <w:proofErr w:type="spellEnd"/>
-      <w:r>
-        <w:t>");</w:t>
-      </w:r>
-      <w:r>
-        <w:br/>
-      </w:r>
-      <w:r>
-        <w:br/>
+      <w:proofErr w:type="gramEnd"/>
+      <w:r>
+        <w:t xml:space="preserve"> real</w:t>
+      </w:r>
+    </w:p>
+    <w:p>
+      <w:pPr>
+        <w:spacing w:after="0" w:line="240" w:lineRule="auto"/>
+        <w:ind w:left="2124"/>
+      </w:pPr>
+      <w:r>
+        <w:t xml:space="preserve">    "</w:t>
+      </w:r>
+      <w:proofErr w:type="spellStart"/>
+      <w:r>
+        <w:t>transporte_lab</w:t>
+      </w:r>
+      <w:proofErr w:type="spellEnd"/>
+      <w:r>
+        <w:t>" // &lt;-- tu base de datos real</w:t>
+      </w:r>
+    </w:p>
+    <w:p>
+      <w:pPr>
+        <w:spacing w:after="0" w:line="240" w:lineRule="auto"/>
+        <w:ind w:left="2124"/>
+      </w:pPr>
+      <w:r>
+        <w:t>);</w:t>
+      </w:r>
+    </w:p>
+    <w:p>
+      <w:pPr>
+        <w:spacing w:after="0" w:line="240" w:lineRule="auto"/>
+        <w:ind w:left="2124"/>
+      </w:pPr>
+    </w:p>
+    <w:p>
+      <w:pPr>
+        <w:spacing w:after="0" w:line="240" w:lineRule="auto"/>
+        <w:ind w:left="2124"/>
+      </w:pPr>
+      <w:proofErr w:type="spellStart"/>
+      <w:r>
+        <w:t>if</w:t>
+      </w:r>
+      <w:proofErr w:type="spellEnd"/>
+      <w:r>
+        <w:t xml:space="preserve"> ($</w:t>
+      </w:r>
+      <w:proofErr w:type="spellStart"/>
+      <w:r>
+        <w:t>conn</w:t>
+      </w:r>
+      <w:proofErr w:type="spellEnd"/>
+      <w:r>
+        <w:t>-&gt;</w:t>
+      </w:r>
+      <w:proofErr w:type="spellStart"/>
+      <w:r>
+        <w:t>connect_error</w:t>
+      </w:r>
+      <w:proofErr w:type="spellEnd"/>
+      <w:r>
+        <w:t>) {</w:t>
+      </w:r>
+    </w:p>
+    <w:p>
+      <w:pPr>
+        <w:spacing w:after="0" w:line="240" w:lineRule="auto"/>
+        <w:ind w:left="2124"/>
+      </w:pPr>
+      <w:r>
+        <w:t xml:space="preserve">    </w:t>
+      </w:r>
+      <w:proofErr w:type="gramStart"/>
+      <w:r>
+        <w:t>die(</w:t>
+      </w:r>
+      <w:proofErr w:type="gramEnd"/>
+      <w:r>
+        <w:t xml:space="preserve">"Error de conexión: </w:t>
+      </w:r>
+      <w:proofErr w:type="gramStart"/>
+      <w:r>
+        <w:t>" .</w:t>
+      </w:r>
+      <w:proofErr w:type="gramEnd"/>
+      <w:r>
+        <w:t xml:space="preserve"> </w:t>
+      </w:r>
+      <w:r>
         <w:t>$</w:t>
       </w:r>
       <w:proofErr w:type="spellStart"/>
       <w:r>
+        <w:t>conn</w:t>
+      </w:r>
+      <w:proofErr w:type="spellEnd"/>
+      <w:r>
+        <w:t>-&gt;</w:t>
+      </w:r>
+      <w:proofErr w:type="spellStart"/>
+      <w:r>
+        <w:t>connect_error</w:t>
+      </w:r>
+      <w:proofErr w:type="spellEnd"/>
+      <w:r>
+        <w:t>);</w:t>
+      </w:r>
+    </w:p>
+    <w:p>
+      <w:pPr>
+        <w:spacing w:after="0" w:line="240" w:lineRule="auto"/>
+        <w:ind w:left="2124"/>
+      </w:pPr>
+      <w:r>
+        <w:t>}</w:t>
+      </w:r>
+    </w:p>
+    <w:p>
+      <w:pPr>
+        <w:spacing w:after="0" w:line="240" w:lineRule="auto"/>
+        <w:ind w:left="2124"/>
+      </w:pPr>
+    </w:p>
+    <w:p>
+      <w:pPr>
+        <w:spacing w:after="0" w:line="240" w:lineRule="auto"/>
+        <w:ind w:left="2124"/>
+      </w:pPr>
+      <w:r>
+        <w:t>$</w:t>
+      </w:r>
+      <w:proofErr w:type="spellStart"/>
+      <w:r>
         <w:t>sql</w:t>
       </w:r>
       <w:proofErr w:type="spellEnd"/>
       <w:r>
         <w:t xml:space="preserve"> = "SELECT </w:t>
       </w:r>
-      <w:r>
-        <w:br/>
+    </w:p>
+    <w:p>
+      <w:pPr>
+        <w:spacing w:after="0" w:line="240" w:lineRule="auto"/>
+        <w:ind w:left="2124"/>
+      </w:pPr>
+      <w:r>
         <w:t xml:space="preserve">    </w:t>
       </w:r>
       <w:proofErr w:type="spellStart"/>
@@ -1940,8 +1664,13 @@
       <w:r>
         <w:t>,</w:t>
       </w:r>
-      <w:r>
-        <w:br/>
+    </w:p>
+    <w:p>
+      <w:pPr>
+        <w:spacing w:after="0" w:line="240" w:lineRule="auto"/>
+        <w:ind w:left="2124"/>
+      </w:pPr>
+      <w:r>
         <w:t xml:space="preserve">    </w:t>
       </w:r>
       <w:proofErr w:type="spellStart"/>
@@ -1952,188 +1681,328 @@
       <w:r>
         <w:t xml:space="preserve"> AS cliente,</w:t>
       </w:r>
-      <w:r>
-        <w:br/>
-      </w:r>
+    </w:p>
+    <w:p>
+      <w:pPr>
+        <w:spacing w:after="0" w:line="240" w:lineRule="auto"/>
+        <w:ind w:left="2124"/>
+      </w:pPr>
+      <w:r>
+        <w:t xml:space="preserve">    </w:t>
+      </w:r>
+      <w:proofErr w:type="spellStart"/>
+      <w:r>
+        <w:t>v.tipo</w:t>
+      </w:r>
+      <w:proofErr w:type="spellEnd"/>
+      <w:r>
+        <w:t xml:space="preserve"> AS </w:t>
+      </w:r>
+      <w:proofErr w:type="spellStart"/>
+      <w:r>
+        <w:t>vehiculo</w:t>
+      </w:r>
+      <w:proofErr w:type="spellEnd"/>
+      <w:r>
+        <w:t>,</w:t>
+      </w:r>
+    </w:p>
+    <w:p>
+      <w:pPr>
+        <w:spacing w:after="0" w:line="240" w:lineRule="auto"/>
+        <w:ind w:left="2124"/>
+      </w:pPr>
+      <w:r>
+        <w:t xml:space="preserve">    </w:t>
+      </w:r>
+      <w:proofErr w:type="spellStart"/>
+      <w:proofErr w:type="gramStart"/>
+      <w:r>
+        <w:t>r.origen</w:t>
+      </w:r>
+      <w:proofErr w:type="spellEnd"/>
+      <w:proofErr w:type="gramEnd"/>
+      <w:r>
+        <w:t>,</w:t>
+      </w:r>
+    </w:p>
+    <w:p>
+      <w:pPr>
+        <w:spacing w:after="0" w:line="240" w:lineRule="auto"/>
+        <w:ind w:left="2124"/>
+      </w:pPr>
+      <w:r>
+        <w:t xml:space="preserve">    </w:t>
+      </w:r>
+      <w:proofErr w:type="spellStart"/>
+      <w:proofErr w:type="gramStart"/>
+      <w:r>
+        <w:t>r.destino</w:t>
+      </w:r>
+      <w:proofErr w:type="spellEnd"/>
+      <w:proofErr w:type="gramEnd"/>
+      <w:r>
+        <w:t>,</w:t>
+      </w:r>
+    </w:p>
+    <w:p>
+      <w:pPr>
+        <w:spacing w:after="0" w:line="240" w:lineRule="auto"/>
+        <w:ind w:left="2124"/>
+      </w:pPr>
+      <w:r>
+        <w:t xml:space="preserve">    </w:t>
+      </w:r>
+      <w:proofErr w:type="spellStart"/>
+      <w:proofErr w:type="gramStart"/>
+      <w:r>
+        <w:t>e.estado</w:t>
+      </w:r>
+      <w:proofErr w:type="spellEnd"/>
+      <w:proofErr w:type="gramEnd"/>
+    </w:p>
+    <w:p>
+      <w:pPr>
+        <w:spacing w:after="0" w:line="240" w:lineRule="auto"/>
+        <w:ind w:left="2124"/>
+      </w:pPr>
       <w:r>
         <w:lastRenderedPageBreak/>
+        <w:t xml:space="preserve">FROM </w:t>
+      </w:r>
+      <w:proofErr w:type="spellStart"/>
+      <w:r>
+        <w:t>envios</w:t>
+      </w:r>
+      <w:proofErr w:type="spellEnd"/>
+      <w:r>
+        <w:t xml:space="preserve"> e</w:t>
+      </w:r>
+    </w:p>
+    <w:p>
+      <w:pPr>
+        <w:spacing w:after="0" w:line="240" w:lineRule="auto"/>
+        <w:ind w:left="2124"/>
+      </w:pPr>
+      <w:r>
+        <w:t xml:space="preserve">JOIN clientes c ON </w:t>
+      </w:r>
+      <w:proofErr w:type="spellStart"/>
+      <w:r>
+        <w:t>e.id_cliente</w:t>
+      </w:r>
+      <w:proofErr w:type="spellEnd"/>
+      <w:r>
+        <w:t xml:space="preserve"> = </w:t>
+      </w:r>
+      <w:proofErr w:type="spellStart"/>
+      <w:r>
+        <w:t>c.id_cliente</w:t>
+      </w:r>
+      <w:proofErr w:type="spellEnd"/>
+    </w:p>
+    <w:p>
+      <w:pPr>
+        <w:spacing w:after="0" w:line="240" w:lineRule="auto"/>
+        <w:ind w:left="2124"/>
+      </w:pPr>
+      <w:r>
+        <w:t xml:space="preserve">JOIN </w:t>
+      </w:r>
+      <w:proofErr w:type="spellStart"/>
+      <w:r>
+        <w:t>vehiculos</w:t>
+      </w:r>
+      <w:proofErr w:type="spellEnd"/>
+      <w:r>
+        <w:t xml:space="preserve"> v ON </w:t>
+      </w:r>
+      <w:proofErr w:type="spellStart"/>
+      <w:r>
+        <w:t>e.id_vehiculo</w:t>
+      </w:r>
+      <w:proofErr w:type="spellEnd"/>
+      <w:r>
+        <w:t xml:space="preserve"> = </w:t>
+      </w:r>
+      <w:proofErr w:type="spellStart"/>
+      <w:r>
+        <w:t>v.id_vehiculo</w:t>
+      </w:r>
+      <w:proofErr w:type="spellEnd"/>
+    </w:p>
+    <w:p>
+      <w:pPr>
+        <w:spacing w:after="0" w:line="240" w:lineRule="auto"/>
+        <w:ind w:left="2124"/>
+        <w:rPr>
+          <w:lang w:val="en-US"/>
+        </w:rPr>
+      </w:pPr>
+      <w:r>
+        <w:rPr>
+          <w:lang w:val="en-US"/>
+        </w:rPr>
+        <w:t xml:space="preserve">JOIN </w:t>
+      </w:r>
+      <w:proofErr w:type="spellStart"/>
+      <w:r>
+        <w:rPr>
+          <w:lang w:val="en-US"/>
+        </w:rPr>
+        <w:t>rutas</w:t>
+      </w:r>
+      <w:proofErr w:type="spellEnd"/>
+      <w:r>
+        <w:rPr>
+          <w:lang w:val="en-US"/>
+        </w:rPr>
+        <w:t xml:space="preserve"> r ON </w:t>
+      </w:r>
+      <w:proofErr w:type="spellStart"/>
+      <w:r>
+        <w:rPr>
+          <w:lang w:val="en-US"/>
+        </w:rPr>
+        <w:t>e.id_ruta</w:t>
+      </w:r>
+      <w:proofErr w:type="spellEnd"/>
+      <w:r>
+        <w:rPr>
+          <w:lang w:val="en-US"/>
+        </w:rPr>
+        <w:t xml:space="preserve"> = </w:t>
+      </w:r>
+      <w:proofErr w:type="spellStart"/>
+      <w:r>
+        <w:rPr>
+          <w:lang w:val="en-US"/>
+        </w:rPr>
+        <w:t>r.id_ruta</w:t>
+      </w:r>
+      <w:proofErr w:type="spellEnd"/>
+      <w:r>
+        <w:rPr>
+          <w:lang w:val="en-US"/>
+        </w:rPr>
+        <w:t>;</w:t>
+      </w:r>
+      <w:proofErr w:type="gramStart"/>
+      <w:r>
+        <w:rPr>
+          <w:lang w:val="en-US"/>
+        </w:rPr>
+        <w:t>";</w:t>
+      </w:r>
+      <w:proofErr w:type="gramEnd"/>
+    </w:p>
+    <w:p>
+      <w:pPr>
+        <w:spacing w:after="0" w:line="240" w:lineRule="auto"/>
+        <w:ind w:left="2124"/>
+        <w:rPr>
+          <w:lang w:val="en-US"/>
+        </w:rPr>
+      </w:pPr>
+    </w:p>
+    <w:p>
+      <w:pPr>
+        <w:spacing w:after="0" w:line="240" w:lineRule="auto"/>
+        <w:ind w:left="2124"/>
+        <w:rPr>
+          <w:lang w:val="en-US"/>
+        </w:rPr>
+      </w:pPr>
+      <w:r>
+        <w:rPr>
+          <w:lang w:val="en-US"/>
+        </w:rPr>
+        <w:t>$result = $conn-&gt;query($</w:t>
+      </w:r>
+      <w:proofErr w:type="spellStart"/>
+      <w:r>
+        <w:rPr>
+          <w:lang w:val="en-US"/>
+        </w:rPr>
+        <w:t>sql</w:t>
+      </w:r>
+      <w:proofErr w:type="spellEnd"/>
+      <w:proofErr w:type="gramStart"/>
+      <w:r>
+        <w:rPr>
+          <w:lang w:val="en-US"/>
+        </w:rPr>
+        <w:t>);</w:t>
+      </w:r>
+      <w:proofErr w:type="gramEnd"/>
+    </w:p>
+    <w:p>
+      <w:pPr>
+        <w:spacing w:after="0" w:line="240" w:lineRule="auto"/>
+        <w:ind w:left="2124"/>
+        <w:rPr>
+          <w:lang w:val="en-US"/>
+        </w:rPr>
+      </w:pPr>
+    </w:p>
+    <w:p>
+      <w:pPr>
+        <w:spacing w:after="0" w:line="240" w:lineRule="auto"/>
+        <w:ind w:left="2124"/>
+        <w:rPr>
+          <w:lang w:val="en-US"/>
+        </w:rPr>
+      </w:pPr>
+      <w:proofErr w:type="gramStart"/>
+      <w:r>
+        <w:rPr>
+          <w:lang w:val="en-US"/>
+        </w:rPr>
+        <w:t>while(</w:t>
+      </w:r>
+      <w:proofErr w:type="gramEnd"/>
+      <w:r>
+        <w:rPr>
+          <w:lang w:val="en-US"/>
+        </w:rPr>
+        <w:t>$row = $result-&gt;</w:t>
+      </w:r>
+      <w:proofErr w:type="spellStart"/>
+      <w:r>
+        <w:rPr>
+          <w:lang w:val="en-US"/>
+        </w:rPr>
+        <w:t>fetch_</w:t>
+      </w:r>
+      <w:proofErr w:type="gramStart"/>
+      <w:r>
+        <w:rPr>
+          <w:lang w:val="en-US"/>
+        </w:rPr>
+        <w:t>assoc</w:t>
+      </w:r>
+      <w:proofErr w:type="spellEnd"/>
+      <w:r>
+        <w:rPr>
+          <w:lang w:val="en-US"/>
+        </w:rPr>
+        <w:t>()) {</w:t>
+      </w:r>
+      <w:proofErr w:type="gramEnd"/>
+    </w:p>
+    <w:p>
+      <w:pPr>
+        <w:spacing w:after="0" w:line="240" w:lineRule="auto"/>
+        <w:ind w:left="2124"/>
+      </w:pPr>
+      <w:r>
+        <w:rPr>
+          <w:lang w:val="en-US"/>
+        </w:rPr>
         <w:t xml:space="preserve">    </w:t>
       </w:r>
-      <w:proofErr w:type="spellStart"/>
-      <w:r>
-        <w:t>v.tipo</w:t>
-      </w:r>
-      <w:proofErr w:type="spellEnd"/>
-      <w:r>
-        <w:t xml:space="preserve"> AS </w:t>
-      </w:r>
-      <w:proofErr w:type="spellStart"/>
-      <w:r>
-        <w:t>vehiculo</w:t>
-      </w:r>
-      <w:proofErr w:type="spellEnd"/>
-      <w:r>
-        <w:t>,</w:t>
-      </w:r>
-      <w:r>
-        <w:br/>
-        <w:t xml:space="preserve">    </w:t>
-      </w:r>
-      <w:proofErr w:type="spellStart"/>
-      <w:r>
-        <w:t>r.origen</w:t>
-      </w:r>
-      <w:proofErr w:type="spellEnd"/>
-      <w:r>
-        <w:t>,</w:t>
-      </w:r>
-      <w:r>
-        <w:br/>
-        <w:t xml:space="preserve">    </w:t>
-      </w:r>
-      <w:proofErr w:type="spellStart"/>
-      <w:r>
-        <w:t>r.destino</w:t>
-      </w:r>
-      <w:proofErr w:type="spellEnd"/>
-      <w:r>
-        <w:t>,</w:t>
-      </w:r>
-      <w:r>
-        <w:br/>
-        <w:t xml:space="preserve">    </w:t>
-      </w:r>
-      <w:proofErr w:type="spellStart"/>
-      <w:r>
-        <w:t>e.estado</w:t>
-      </w:r>
-      <w:proofErr w:type="spellEnd"/>
-      <w:r>
-        <w:br/>
-        <w:t xml:space="preserve">FROM </w:t>
-      </w:r>
-      <w:proofErr w:type="spellStart"/>
-      <w:r>
-        <w:t>envios</w:t>
-      </w:r>
-      <w:proofErr w:type="spellEnd"/>
-      <w:r>
-        <w:t xml:space="preserve"> e</w:t>
-      </w:r>
-      <w:r>
-        <w:br/>
-        <w:t xml:space="preserve">JOIN clientes c ON </w:t>
-      </w:r>
-      <w:proofErr w:type="spellStart"/>
-      <w:r>
-        <w:t>e.id_cliente</w:t>
-      </w:r>
-      <w:proofErr w:type="spellEnd"/>
-      <w:r>
-        <w:t xml:space="preserve"> = </w:t>
-      </w:r>
-      <w:proofErr w:type="spellStart"/>
-      <w:r>
-        <w:t>c.id_cliente</w:t>
-      </w:r>
-      <w:proofErr w:type="spellEnd"/>
-      <w:r>
-        <w:br/>
-        <w:t xml:space="preserve">JOIN </w:t>
-      </w:r>
-      <w:proofErr w:type="spellStart"/>
-      <w:r>
-        <w:t>vehiculos</w:t>
-      </w:r>
-      <w:proofErr w:type="spellEnd"/>
-      <w:r>
-        <w:t xml:space="preserve"> v ON </w:t>
-      </w:r>
-      <w:proofErr w:type="spellStart"/>
-      <w:r>
-        <w:t>e.id_vehiculo</w:t>
-      </w:r>
-      <w:proofErr w:type="spellEnd"/>
-      <w:r>
-        <w:t xml:space="preserve"> = </w:t>
-      </w:r>
-      <w:proofErr w:type="spellStart"/>
-      <w:r>
-        <w:t>v.id_vehiculo</w:t>
-      </w:r>
-      <w:proofErr w:type="spellEnd"/>
-      <w:r>
-        <w:br/>
-        <w:t xml:space="preserve">JOIN rutas r ON </w:t>
-      </w:r>
-      <w:proofErr w:type="spellStart"/>
-      <w:r>
-        <w:t>e.id_ruta</w:t>
-      </w:r>
-      <w:proofErr w:type="spellEnd"/>
-      <w:r>
-        <w:t xml:space="preserve"> = </w:t>
-      </w:r>
-      <w:proofErr w:type="spellStart"/>
-      <w:r>
-        <w:t>r.id_ruta</w:t>
-      </w:r>
-      <w:proofErr w:type="spellEnd"/>
-      <w:r>
-        <w:t>;";</w:t>
-      </w:r>
-      <w:r>
-        <w:br/>
-      </w:r>
-      <w:r>
-        <w:br/>
-        <w:t>$</w:t>
-      </w:r>
-      <w:proofErr w:type="spellStart"/>
-      <w:r>
-        <w:t>result</w:t>
-      </w:r>
-      <w:proofErr w:type="spellEnd"/>
-      <w:r>
-        <w:t xml:space="preserve"> = $</w:t>
-      </w:r>
-      <w:proofErr w:type="spellStart"/>
-      <w:r>
-        <w:t>conn</w:t>
-      </w:r>
-      <w:proofErr w:type="spellEnd"/>
-      <w:r>
-        <w:t>-&gt;</w:t>
-      </w:r>
-      <w:proofErr w:type="spellStart"/>
-      <w:r>
-        <w:t>query</w:t>
-      </w:r>
-      <w:proofErr w:type="spellEnd"/>
-      <w:r>
-        <w:t>($</w:t>
-      </w:r>
-      <w:proofErr w:type="spellStart"/>
-      <w:r>
-        <w:t>sql</w:t>
-      </w:r>
-      <w:proofErr w:type="spellEnd"/>
-      <w:r>
-        <w:t>);</w:t>
-      </w:r>
-      <w:r>
-        <w:br/>
-      </w:r>
-      <w:r>
-        <w:br/>
-      </w:r>
-      <w:proofErr w:type="spellStart"/>
-      <w:r>
-        <w:t>while</w:t>
-      </w:r>
-      <w:proofErr w:type="spellEnd"/>
-      <w:r>
-        <w:t>($</w:t>
+      <w:r>
+        <w:t>echo $</w:t>
       </w:r>
       <w:proofErr w:type="spellStart"/>
       <w:r>
@@ -2141,27 +2010,15 @@
       </w:r>
       <w:proofErr w:type="spellEnd"/>
       <w:r>
-        <w:t xml:space="preserve"> = $</w:t>
-      </w:r>
-      <w:proofErr w:type="spellStart"/>
-      <w:r>
-        <w:t>result</w:t>
-      </w:r>
-      <w:proofErr w:type="spellEnd"/>
-      <w:r>
-        <w:t>-&gt;</w:t>
-      </w:r>
-      <w:proofErr w:type="spellStart"/>
-      <w:r>
-        <w:t>fetch_assoc</w:t>
-      </w:r>
-      <w:proofErr w:type="spellEnd"/>
-      <w:r>
-        <w:t>()) {</w:t>
-      </w:r>
-      <w:r>
-        <w:br/>
-        <w:t xml:space="preserve">    echo $</w:t>
+        <w:t>["cliente"</w:t>
+      </w:r>
+      <w:proofErr w:type="gramStart"/>
+      <w:r>
+        <w:t>] .</w:t>
+      </w:r>
+      <w:proofErr w:type="gramEnd"/>
+      <w:r>
+        <w:t xml:space="preserve"> " - " . $</w:t>
       </w:r>
       <w:proofErr w:type="spellStart"/>
       <w:r>
@@ -2169,14 +2026,6 @@
       </w:r>
       <w:proofErr w:type="spellEnd"/>
       <w:r>
-        <w:t>["cliente"] . " - " . $</w:t>
-      </w:r>
-      <w:proofErr w:type="spellStart"/>
-      <w:r>
-        <w:t>row</w:t>
-      </w:r>
-      <w:proofErr w:type="spellEnd"/>
-      <w:r>
         <w:t>["estado"</w:t>
       </w:r>
       <w:proofErr w:type="gramStart"/>
@@ -2195,12 +2044,22 @@
       <w:r>
         <w:t>&gt;";</w:t>
       </w:r>
-      <w:r>
-        <w:br/>
+    </w:p>
+    <w:p>
+      <w:pPr>
+        <w:spacing w:after="0" w:line="240" w:lineRule="auto"/>
+        <w:ind w:left="2124"/>
+      </w:pPr>
+      <w:r>
         <w:t>}</w:t>
       </w:r>
-      <w:r>
-        <w:br/>
+    </w:p>
+    <w:p>
+      <w:pPr>
+        <w:spacing w:after="0" w:line="240" w:lineRule="auto"/>
+        <w:ind w:left="2124"/>
+      </w:pPr>
+      <w:r>
         <w:t>?&gt;</w:t>
       </w:r>
     </w:p>
@@ -2224,7 +2083,7 @@
           <w:b/>
           <w:bCs/>
         </w:rPr>
-        <w:t>5. Probar</w:t>
+        <w:t>Dar permisos</w:t>
       </w:r>
     </w:p>
     <w:p>
@@ -2299,7 +2158,24 @@
     <w:p>
       <w:pPr>
         <w:spacing w:after="0" w:line="240" w:lineRule="auto"/>
-        <w:ind w:left="708" w:firstLine="708"/>
+        <w:ind w:firstLine="708"/>
+        <w:rPr>
+          <w:b/>
+          <w:bCs/>
+        </w:rPr>
+      </w:pPr>
+      <w:r>
+        <w:rPr>
+          <w:b/>
+          <w:bCs/>
+        </w:rPr>
+        <w:t>Dar permisos</w:t>
+      </w:r>
+    </w:p>
+    <w:p>
+      <w:pPr>
+        <w:spacing w:after="0" w:line="240" w:lineRule="auto"/>
+        <w:ind w:left="708"/>
       </w:pPr>
     </w:p>
     <w:p>
@@ -2581,22 +2457,45 @@
       <w:pPr>
         <w:spacing w:after="0" w:line="240" w:lineRule="auto"/>
         <w:ind w:left="708"/>
-      </w:pPr>
-      <w:r>
-        <w:t>Permisos:</w:t>
+        <w:rPr>
+          <w:lang w:val="en-US"/>
+        </w:rPr>
+      </w:pPr>
+      <w:proofErr w:type="spellStart"/>
+      <w:r>
+        <w:rPr>
+          <w:lang w:val="en-US"/>
+        </w:rPr>
+        <w:t>Permisos</w:t>
+      </w:r>
+      <w:proofErr w:type="spellEnd"/>
+      <w:r>
+        <w:rPr>
+          <w:lang w:val="en-US"/>
+        </w:rPr>
+        <w:t>:</w:t>
       </w:r>
     </w:p>
     <w:p>
       <w:pPr>
         <w:spacing w:after="0" w:line="240" w:lineRule="auto"/>
         <w:ind w:left="708" w:firstLine="708"/>
-      </w:pPr>
-      <w:proofErr w:type="spellStart"/>
-      <w:r>
+        <w:rPr>
+          <w:lang w:val="en-US"/>
+        </w:rPr>
+      </w:pPr>
+      <w:proofErr w:type="spellStart"/>
+      <w:r>
+        <w:rPr>
+          <w:lang w:val="en-US"/>
+        </w:rPr>
         <w:t>chmod</w:t>
       </w:r>
       <w:proofErr w:type="spellEnd"/>
       <w:r>
+        <w:rPr>
+          <w:lang w:val="en-US"/>
+        </w:rPr>
         <w:t xml:space="preserve"> +x scripts/deploy.sh</w:t>
       </w:r>
     </w:p>
@@ -2604,6 +2503,9 @@
       <w:pPr>
         <w:spacing w:after="0" w:line="240" w:lineRule="auto"/>
         <w:ind w:left="708"/>
+        <w:rPr>
+          <w:lang w:val="en-US"/>
+        </w:rPr>
       </w:pPr>
     </w:p>
     <w:p>
@@ -2673,7 +2575,6 @@
         <w:rPr>
           <w:lang w:val="en-US"/>
         </w:rPr>
-        <w:lastRenderedPageBreak/>
         <w:t>version: 0.0</w:t>
       </w:r>
       <w:r>
@@ -2722,6 +2623,12 @@
           <w:lang w:val="en-US"/>
         </w:rPr>
         <w:br/>
+      </w:r>
+      <w:r>
+        <w:rPr>
+          <w:lang w:val="en-US"/>
+        </w:rPr>
+        <w:lastRenderedPageBreak/>
         <w:t xml:space="preserve">  - source: /</w:t>
       </w:r>
       <w:r>
@@ -2805,6 +2712,9 @@
       <w:pPr>
         <w:spacing w:after="0" w:line="240" w:lineRule="auto"/>
         <w:ind w:left="708"/>
+        <w:rPr>
+          <w:lang w:val="en-US"/>
+        </w:rPr>
       </w:pPr>
     </w:p>
     <w:p>
@@ -2889,7 +2799,20 @@
           <w:lang w:val="en-US"/>
         </w:rPr>
         <w:br/>
-        <w:t>git remote add origin https://github.com/TU_REPO.git</w:t>
+        <w:t>git remote add origin https://github.com/</w:t>
+      </w:r>
+      <w:r>
+        <w:rPr>
+          <w:highlight w:val="green"/>
+          <w:lang w:val="en-US"/>
+        </w:rPr>
+        <w:t>TU_REPO</w:t>
+      </w:r>
+      <w:r>
+        <w:rPr>
+          <w:lang w:val="en-US"/>
+        </w:rPr>
+        <w:t>.git</w:t>
       </w:r>
       <w:r>
         <w:rPr>
@@ -2902,6 +2825,9 @@
     <w:p>
       <w:pPr>
         <w:spacing w:after="0" w:line="240" w:lineRule="auto"/>
+        <w:rPr>
+          <w:lang w:val="en-US"/>
+        </w:rPr>
       </w:pPr>
     </w:p>
     <w:p>
@@ -2957,88 +2883,112 @@
       <w:pPr>
         <w:spacing w:after="0" w:line="240" w:lineRule="auto"/>
         <w:ind w:left="1416"/>
-      </w:pPr>
-      <w:r>
-        <w:t xml:space="preserve">sudo </w:t>
-      </w:r>
-      <w:proofErr w:type="spellStart"/>
-      <w:r>
-        <w:t>yum</w:t>
-      </w:r>
-      <w:proofErr w:type="spellEnd"/>
-      <w:r>
-        <w:t xml:space="preserve"> </w:t>
-      </w:r>
-      <w:proofErr w:type="spellStart"/>
-      <w:r>
-        <w:t>install</w:t>
-      </w:r>
-      <w:proofErr w:type="spellEnd"/>
-      <w:r>
-        <w:t xml:space="preserve"> -y </w:t>
-      </w:r>
-      <w:proofErr w:type="spellStart"/>
-      <w:r>
-        <w:t>ruby</w:t>
-      </w:r>
-      <w:proofErr w:type="spellEnd"/>
-      <w:r>
+        <w:rPr>
+          <w:lang w:val="en-US"/>
+        </w:rPr>
+      </w:pPr>
+      <w:proofErr w:type="spellStart"/>
+      <w:r>
+        <w:rPr>
+          <w:lang w:val="en-US"/>
+        </w:rPr>
+        <w:t>sudo</w:t>
+      </w:r>
+      <w:proofErr w:type="spellEnd"/>
+      <w:r>
+        <w:rPr>
+          <w:lang w:val="en-US"/>
+        </w:rPr>
+        <w:t xml:space="preserve"> yum install -y ruby</w:t>
+      </w:r>
+      <w:r>
+        <w:rPr>
+          <w:lang w:val="en-US"/>
+        </w:rPr>
         <w:br/>
         <w:t>cd /home/ec2-user</w:t>
       </w:r>
       <w:r>
+        <w:rPr>
+          <w:lang w:val="en-US"/>
+        </w:rPr>
         <w:br/>
       </w:r>
       <w:proofErr w:type="spellStart"/>
       <w:r>
+        <w:rPr>
+          <w:lang w:val="en-US"/>
+        </w:rPr>
         <w:t>wget</w:t>
       </w:r>
       <w:proofErr w:type="spellEnd"/>
       <w:r>
+        <w:rPr>
+          <w:lang w:val="en-US"/>
+        </w:rPr>
         <w:t xml:space="preserve"> https://aws-codedeploy-us-east-1.s3.us-east-1.amazonaws.com/latest/install</w:t>
       </w:r>
       <w:r>
+        <w:rPr>
+          <w:lang w:val="en-US"/>
+        </w:rPr>
         <w:br/>
       </w:r>
       <w:proofErr w:type="spellStart"/>
       <w:r>
+        <w:rPr>
+          <w:lang w:val="en-US"/>
+        </w:rPr>
         <w:t>chmod</w:t>
       </w:r>
       <w:proofErr w:type="spellEnd"/>
       <w:r>
+        <w:rPr>
+          <w:lang w:val="en-US"/>
+        </w:rPr>
         <w:t xml:space="preserve"> +</w:t>
       </w:r>
       <w:proofErr w:type="gramStart"/>
       <w:r>
+        <w:rPr>
+          <w:lang w:val="en-US"/>
+        </w:rPr>
         <w:t>x .</w:t>
       </w:r>
       <w:proofErr w:type="gramEnd"/>
       <w:r>
-        <w:t>/</w:t>
-      </w:r>
-      <w:proofErr w:type="spellStart"/>
-      <w:r>
-        <w:t>install</w:t>
-      </w:r>
-      <w:proofErr w:type="spellEnd"/>
-      <w:r>
+        <w:rPr>
+          <w:lang w:val="en-US"/>
+        </w:rPr>
+        <w:t>/install</w:t>
+      </w:r>
+      <w:r>
+        <w:rPr>
+          <w:lang w:val="en-US"/>
+        </w:rPr>
         <w:br/>
       </w:r>
+      <w:proofErr w:type="spellStart"/>
       <w:proofErr w:type="gramStart"/>
       <w:r>
-        <w:t>sudo .</w:t>
+        <w:rPr>
+          <w:lang w:val="en-US"/>
+        </w:rPr>
+        <w:t>sudo</w:t>
+      </w:r>
+      <w:proofErr w:type="spellEnd"/>
+      <w:r>
+        <w:rPr>
+          <w:lang w:val="en-US"/>
+        </w:rPr>
+        <w:t xml:space="preserve"> .</w:t>
       </w:r>
       <w:proofErr w:type="gramEnd"/>
       <w:r>
-        <w:t>/</w:t>
-      </w:r>
-      <w:proofErr w:type="spellStart"/>
-      <w:r>
-        <w:t>install</w:t>
-      </w:r>
-      <w:proofErr w:type="spellEnd"/>
-      <w:r>
-        <w:t xml:space="preserve"> auto</w:t>
+        <w:rPr>
+          <w:lang w:val="en-US"/>
+        </w:rPr>
+        <w:t>/install auto</w:t>
       </w:r>
     </w:p>
     <w:p>
@@ -3322,7 +3272,6 @@
         <w:ind w:left="1800"/>
       </w:pPr>
       <w:r>
-        <w:lastRenderedPageBreak/>
         <w:t xml:space="preserve">Selecciona tu EC2 (por tag) </w:t>
       </w:r>
     </w:p>
@@ -3387,6 +3336,7 @@
         <w:ind w:left="708"/>
       </w:pPr>
       <w:r>
+        <w:lastRenderedPageBreak/>
         <w:t xml:space="preserve">En AWS </w:t>
       </w:r>
       <w:proofErr w:type="spellStart"/>
@@ -3812,12 +3762,16 @@
         <w:rPr>
           <w:b/>
           <w:bCs/>
-        </w:rPr>
-      </w:pPr>
-    </w:p>
-    <w:p>
-      <w:pPr>
-        <w:spacing w:after="0" w:line="240" w:lineRule="auto"/>
+          <w:lang w:val="en-US"/>
+        </w:rPr>
+      </w:pPr>
+    </w:p>
+    <w:p>
+      <w:pPr>
+        <w:spacing w:after="0" w:line="240" w:lineRule="auto"/>
+        <w:rPr>
+          <w:lang w:val="en-US"/>
+        </w:rPr>
       </w:pPr>
     </w:p>
     <w:sectPr>
@@ -6403,6 +6357,7 @@
   <w:style w:type="character" w:default="1" w:styleId="Fuentedeprrafopredeter">
     <w:name w:val="Default Paragraph Font"/>
     <w:uiPriority w:val="1"/>
+    <w:semiHidden/>
     <w:unhideWhenUsed/>
   </w:style>
   <w:style w:type="table" w:default="1" w:styleId="Tablanormal">

</xml_diff>

<commit_message>
Primer cambio desde el repositorio de mo lap
</commit_message>
<xml_diff>
--- a/PIPERLINE.docx
+++ b/PIPERLINE.docx
@@ -496,7 +496,7 @@
           <w:b/>
           <w:bCs/>
         </w:rPr>
-        <w:t>Paso</w:t>
+        <w:t>Parte</w:t>
       </w:r>
       <w:r>
         <w:rPr>
@@ -2169,14 +2169,8 @@
           <w:b/>
           <w:bCs/>
         </w:rPr>
-        <w:t>Dar permisos</w:t>
-      </w:r>
-    </w:p>
-    <w:p>
-      <w:pPr>
-        <w:spacing w:after="0" w:line="240" w:lineRule="auto"/>
-        <w:ind w:left="708"/>
-      </w:pPr>
+        <w:t xml:space="preserve">Probar </w:t>
+      </w:r>
     </w:p>
     <w:p>
       <w:pPr>
@@ -2623,19 +2617,19 @@
           <w:lang w:val="en-US"/>
         </w:rPr>
         <w:br/>
+        <w:t xml:space="preserve">  - source: /</w:t>
+      </w:r>
+      <w:r>
+        <w:rPr>
+          <w:lang w:val="en-US"/>
+        </w:rPr>
+        <w:br/>
       </w:r>
       <w:r>
         <w:rPr>
           <w:lang w:val="en-US"/>
         </w:rPr>
         <w:lastRenderedPageBreak/>
-        <w:t xml:space="preserve">  - source: /</w:t>
-      </w:r>
-      <w:r>
-        <w:rPr>
-          <w:lang w:val="en-US"/>
-        </w:rPr>
-        <w:br/>
         <w:t xml:space="preserve">    destination: /home/ec2-user/app</w:t>
       </w:r>
       <w:r>
@@ -2719,27 +2713,109 @@
     </w:p>
     <w:p>
       <w:pPr>
-        <w:spacing w:after="0" w:line="240" w:lineRule="auto"/>
-        <w:ind w:left="708"/>
-        <w:rPr>
-          <w:b/>
-          <w:bCs/>
-        </w:rPr>
-      </w:pPr>
-      <w:r>
-        <w:rPr>
-          <w:b/>
-          <w:bCs/>
-        </w:rPr>
-        <w:t>4. Subir a GitHub</w:t>
+        <w:pStyle w:val="Prrafodelista"/>
+        <w:numPr>
+          <w:ilvl w:val="0"/>
+          <w:numId w:val="2"/>
+        </w:numPr>
+        <w:spacing w:after="0" w:line="240" w:lineRule="auto"/>
+        <w:rPr>
+          <w:b/>
+          <w:bCs/>
+        </w:rPr>
+      </w:pPr>
+      <w:r>
+        <w:rPr>
+          <w:b/>
+          <w:bCs/>
+        </w:rPr>
+        <w:t>Subir a GitHub</w:t>
       </w:r>
     </w:p>
     <w:p>
       <w:pPr>
         <w:spacing w:after="0" w:line="240" w:lineRule="auto"/>
         <w:ind w:left="1416"/>
-      </w:pPr>
-      <w:r>
+        <w:rPr>
+          <w:b/>
+          <w:bCs/>
+        </w:rPr>
+      </w:pPr>
+      <w:r>
+        <w:rPr>
+          <w:b/>
+          <w:bCs/>
+        </w:rPr>
+        <w:t xml:space="preserve">Instalar </w:t>
+      </w:r>
+    </w:p>
+    <w:p>
+      <w:pPr>
+        <w:spacing w:after="0" w:line="240" w:lineRule="auto"/>
+        <w:ind w:left="1416"/>
+      </w:pPr>
+      <w:r>
+        <w:t xml:space="preserve">sudo </w:t>
+      </w:r>
+      <w:proofErr w:type="spellStart"/>
+      <w:r>
+        <w:t>yum</w:t>
+      </w:r>
+      <w:proofErr w:type="spellEnd"/>
+      <w:r>
+        <w:t xml:space="preserve"> </w:t>
+      </w:r>
+      <w:proofErr w:type="spellStart"/>
+      <w:r>
+        <w:t>update</w:t>
+      </w:r>
+      <w:proofErr w:type="spellEnd"/>
+      <w:r>
+        <w:t xml:space="preserve"> -y</w:t>
+      </w:r>
+      <w:r>
+        <w:br/>
+        <w:t xml:space="preserve">sudo </w:t>
+      </w:r>
+      <w:proofErr w:type="spellStart"/>
+      <w:r>
+        <w:t>yum</w:t>
+      </w:r>
+      <w:proofErr w:type="spellEnd"/>
+      <w:r>
+        <w:t xml:space="preserve"> </w:t>
+      </w:r>
+      <w:proofErr w:type="spellStart"/>
+      <w:r>
+        <w:t>install</w:t>
+      </w:r>
+      <w:proofErr w:type="spellEnd"/>
+      <w:r>
+        <w:t xml:space="preserve"> </w:t>
+      </w:r>
+      <w:proofErr w:type="spellStart"/>
+      <w:r>
+        <w:t>git</w:t>
+      </w:r>
+      <w:proofErr w:type="spellEnd"/>
+      <w:r>
+        <w:t xml:space="preserve"> -y</w:t>
+      </w:r>
+    </w:p>
+    <w:p>
+      <w:pPr>
+        <w:spacing w:after="0" w:line="240" w:lineRule="auto"/>
+        <w:ind w:left="1416"/>
+        <w:rPr>
+          <w:b/>
+          <w:bCs/>
+        </w:rPr>
+      </w:pPr>
+      <w:r>
+        <w:rPr>
+          <w:b/>
+          <w:bCs/>
+        </w:rPr>
         <w:t>Usa GitHub:</w:t>
       </w:r>
     </w:p>
@@ -2765,11 +2841,19 @@
         <w:t>init</w:t>
       </w:r>
       <w:proofErr w:type="spellEnd"/>
-      <w:r>
-        <w:rPr>
-          <w:lang w:val="en-US"/>
-        </w:rPr>
-        <w:br/>
+    </w:p>
+    <w:p>
+      <w:pPr>
+        <w:spacing w:after="0" w:line="240" w:lineRule="auto"/>
+        <w:ind w:left="1416"/>
+        <w:rPr>
+          <w:lang w:val="en-US"/>
+        </w:rPr>
+      </w:pPr>
+      <w:r>
+        <w:rPr>
+          <w:lang w:val="en-US"/>
+        </w:rPr>
         <w:t xml:space="preserve">git </w:t>
       </w:r>
       <w:proofErr w:type="gramStart"/>
@@ -2794,26 +2878,59 @@
         <w:br/>
         <w:t>git branch -M main</w:t>
       </w:r>
-      <w:r>
-        <w:rPr>
-          <w:lang w:val="en-US"/>
-        </w:rPr>
-        <w:br/>
-        <w:t>git remote add origin https://github.com/</w:t>
-      </w:r>
-      <w:r>
-        <w:rPr>
-          <w:highlight w:val="green"/>
-          <w:lang w:val="en-US"/>
-        </w:rPr>
-        <w:t>TU_REPO</w:t>
-      </w:r>
-      <w:r>
-        <w:rPr>
-          <w:lang w:val="en-US"/>
-        </w:rPr>
-        <w:t>.git</w:t>
-      </w:r>
+    </w:p>
+    <w:p>
+      <w:pPr>
+        <w:spacing w:after="0" w:line="240" w:lineRule="auto"/>
+        <w:ind w:left="1416"/>
+        <w:rPr>
+          <w:lang w:val="en-US"/>
+        </w:rPr>
+      </w:pPr>
+      <w:r>
+        <w:rPr>
+          <w:lang w:val="en-US"/>
+        </w:rPr>
+        <w:t>git remote set-</w:t>
+      </w:r>
+      <w:proofErr w:type="spellStart"/>
+      <w:r>
+        <w:rPr>
+          <w:lang w:val="en-US"/>
+        </w:rPr>
+        <w:t>url</w:t>
+      </w:r>
+      <w:proofErr w:type="spellEnd"/>
+      <w:r>
+        <w:rPr>
+          <w:lang w:val="en-US"/>
+        </w:rPr>
+        <w:t xml:space="preserve"> origin </w:t>
+      </w:r>
+      <w:proofErr w:type="spellStart"/>
+      <w:proofErr w:type="gramStart"/>
+      <w:r>
+        <w:rPr>
+          <w:lang w:val="en-US"/>
+        </w:rPr>
+        <w:t>git@github.com:jorgehinojosaTecMi</w:t>
+      </w:r>
+      <w:proofErr w:type="spellEnd"/>
+      <w:r>
+        <w:rPr>
+          <w:lang w:val="en-US"/>
+        </w:rPr>
+        <w:t>/mi-</w:t>
+      </w:r>
+      <w:proofErr w:type="spellStart"/>
+      <w:r>
+        <w:rPr>
+          <w:lang w:val="en-US"/>
+        </w:rPr>
+        <w:t>lab.git</w:t>
+      </w:r>
+      <w:proofErr w:type="spellEnd"/>
+      <w:proofErr w:type="gramEnd"/>
       <w:r>
         <w:rPr>
           <w:lang w:val="en-US"/>
@@ -2843,6 +2960,334 @@
           <w:b/>
           <w:bCs/>
         </w:rPr>
+        <w:t>Ruta correcta en GitHub</w:t>
+      </w:r>
+    </w:p>
+    <w:p>
+      <w:pPr>
+        <w:spacing w:after="0" w:line="240" w:lineRule="auto"/>
+        <w:ind w:firstLine="360"/>
+        <w:rPr>
+          <w:b/>
+          <w:bCs/>
+        </w:rPr>
+      </w:pPr>
+      <w:r>
+        <w:rPr>
+          <w:b/>
+          <w:bCs/>
+        </w:rPr>
+        <w:t>Método 2 (paso a paso)</w:t>
+      </w:r>
+    </w:p>
+    <w:p>
+      <w:pPr>
+        <w:spacing w:after="0" w:line="240" w:lineRule="auto"/>
+        <w:ind w:left="708"/>
+      </w:pPr>
+      <w:r>
+        <w:t xml:space="preserve">En la esquina superior derecha → da clic a tu foto de perfil </w:t>
+      </w:r>
+    </w:p>
+    <w:p>
+      <w:pPr>
+        <w:spacing w:after="0" w:line="240" w:lineRule="auto"/>
+        <w:ind w:left="708"/>
+      </w:pPr>
+      <w:r>
+        <w:t xml:space="preserve">Clic en </w:t>
+      </w:r>
+      <w:proofErr w:type="spellStart"/>
+      <w:r>
+        <w:rPr>
+          <w:b/>
+          <w:bCs/>
+        </w:rPr>
+        <w:t>Settings</w:t>
+      </w:r>
+      <w:proofErr w:type="spellEnd"/>
+      <w:r>
+        <w:t xml:space="preserve"> </w:t>
+      </w:r>
+    </w:p>
+    <w:p>
+      <w:pPr>
+        <w:spacing w:after="0" w:line="240" w:lineRule="auto"/>
+        <w:ind w:left="708"/>
+      </w:pPr>
+      <w:r>
+        <w:rPr>
+          <w:b/>
+          <w:bCs/>
+        </w:rPr>
+        <w:t xml:space="preserve">SSH and GPG </w:t>
+      </w:r>
+      <w:proofErr w:type="spellStart"/>
+      <w:r>
+        <w:rPr>
+          <w:b/>
+          <w:bCs/>
+        </w:rPr>
+        <w:t>keys</w:t>
+      </w:r>
+      <w:proofErr w:type="spellEnd"/>
+      <w:r>
+        <w:t xml:space="preserve"> </w:t>
+      </w:r>
+    </w:p>
+    <w:p>
+      <w:pPr>
+        <w:spacing w:after="0" w:line="240" w:lineRule="auto"/>
+        <w:ind w:firstLine="360"/>
+        <w:rPr>
+          <w:b/>
+          <w:bCs/>
+        </w:rPr>
+      </w:pPr>
+      <w:r>
+        <w:rPr>
+          <w:b/>
+          <w:bCs/>
+        </w:rPr>
+        <w:t>Agregar la clave</w:t>
+      </w:r>
+    </w:p>
+    <w:p>
+      <w:pPr>
+        <w:spacing w:after="0" w:line="240" w:lineRule="auto"/>
+        <w:ind w:left="708"/>
+      </w:pPr>
+      <w:r>
+        <w:t xml:space="preserve">Clic en </w:t>
+      </w:r>
+      <w:r>
+        <w:rPr>
+          <w:b/>
+          <w:bCs/>
+        </w:rPr>
+        <w:t xml:space="preserve">New SSH </w:t>
+      </w:r>
+      <w:proofErr w:type="spellStart"/>
+      <w:r>
+        <w:rPr>
+          <w:b/>
+          <w:bCs/>
+        </w:rPr>
+        <w:t>key</w:t>
+      </w:r>
+      <w:proofErr w:type="spellEnd"/>
+      <w:r>
+        <w:t xml:space="preserve"> </w:t>
+      </w:r>
+    </w:p>
+    <w:p>
+      <w:pPr>
+        <w:spacing w:after="0" w:line="240" w:lineRule="auto"/>
+        <w:ind w:left="708"/>
+      </w:pPr>
+      <w:r>
+        <w:t xml:space="preserve">Llena: </w:t>
+      </w:r>
+    </w:p>
+    <w:p>
+      <w:pPr>
+        <w:spacing w:after="0" w:line="240" w:lineRule="auto"/>
+        <w:ind w:left="1428"/>
+      </w:pPr>
+      <w:r>
+        <w:rPr>
+          <w:b/>
+          <w:bCs/>
+        </w:rPr>
+        <w:t>Title</w:t>
+      </w:r>
+      <w:r>
+        <w:t xml:space="preserve">: algo como EC2 AWS </w:t>
+      </w:r>
+      <w:proofErr w:type="spellStart"/>
+      <w:r>
+        <w:t>Academy</w:t>
+      </w:r>
+      <w:proofErr w:type="spellEnd"/>
+      <w:r>
+        <w:t xml:space="preserve"> </w:t>
+      </w:r>
+    </w:p>
+    <w:p>
+      <w:pPr>
+        <w:spacing w:after="0" w:line="240" w:lineRule="auto"/>
+        <w:ind w:left="1428"/>
+      </w:pPr>
+      <w:r>
+        <w:rPr>
+          <w:b/>
+          <w:bCs/>
+        </w:rPr>
+        <w:t>Key</w:t>
+      </w:r>
+      <w:r>
+        <w:t>: pega lo que copiaste de:</w:t>
+      </w:r>
+    </w:p>
+    <w:p>
+      <w:pPr>
+        <w:spacing w:after="0" w:line="240" w:lineRule="auto"/>
+        <w:ind w:left="1428"/>
+      </w:pPr>
+      <w:proofErr w:type="spellStart"/>
+      <w:r>
+        <w:t>cat</w:t>
+      </w:r>
+      <w:proofErr w:type="spellEnd"/>
+      <w:r>
+        <w:t xml:space="preserve"> ~/.</w:t>
+      </w:r>
+      <w:proofErr w:type="spellStart"/>
+      <w:r>
+        <w:t>ssh</w:t>
+      </w:r>
+      <w:proofErr w:type="spellEnd"/>
+      <w:r>
+        <w:t>/id_rsa.pub</w:t>
+      </w:r>
+    </w:p>
+    <w:p>
+      <w:pPr>
+        <w:spacing w:after="0" w:line="240" w:lineRule="auto"/>
+        <w:ind w:left="708"/>
+        <w:rPr>
+          <w:b/>
+          <w:bCs/>
+        </w:rPr>
+      </w:pPr>
+      <w:r>
+        <w:t xml:space="preserve">Clic en </w:t>
+      </w:r>
+      <w:r>
+        <w:rPr>
+          <w:b/>
+          <w:bCs/>
+        </w:rPr>
+        <w:t xml:space="preserve">Add SSH </w:t>
+      </w:r>
+      <w:proofErr w:type="spellStart"/>
+      <w:r>
+        <w:rPr>
+          <w:b/>
+          <w:bCs/>
+        </w:rPr>
+        <w:t>key</w:t>
+      </w:r>
+      <w:proofErr w:type="spellEnd"/>
+    </w:p>
+    <w:p>
+      <w:pPr>
+        <w:spacing w:after="0" w:line="240" w:lineRule="auto"/>
+        <w:ind w:left="708"/>
+      </w:pPr>
+    </w:p>
+    <w:p>
+      <w:pPr>
+        <w:spacing w:after="0" w:line="240" w:lineRule="auto"/>
+        <w:ind w:left="360"/>
+        <w:rPr>
+          <w:b/>
+          <w:bCs/>
+          <w:lang w:val="en-US"/>
+        </w:rPr>
+      </w:pPr>
+      <w:r>
+        <w:rPr>
+          <w:b/>
+          <w:bCs/>
+          <w:lang w:val="en-US"/>
+        </w:rPr>
+        <w:t xml:space="preserve">Para </w:t>
+      </w:r>
+      <w:proofErr w:type="spellStart"/>
+      <w:r>
+        <w:rPr>
+          <w:b/>
+          <w:bCs/>
+          <w:lang w:val="en-US"/>
+        </w:rPr>
+        <w:t>compro</w:t>
+      </w:r>
+      <w:r>
+        <w:rPr>
+          <w:b/>
+          <w:bCs/>
+          <w:lang w:val="en-US"/>
+        </w:rPr>
+        <w:t>b</w:t>
+      </w:r>
+      <w:r>
+        <w:rPr>
+          <w:b/>
+          <w:bCs/>
+          <w:lang w:val="en-US"/>
+        </w:rPr>
+        <w:t>ar</w:t>
+      </w:r>
+      <w:proofErr w:type="spellEnd"/>
+      <w:r>
+        <w:rPr>
+          <w:b/>
+          <w:bCs/>
+          <w:lang w:val="en-US"/>
+        </w:rPr>
+        <w:t xml:space="preserve"> la connexon </w:t>
+      </w:r>
+    </w:p>
+    <w:p>
+      <w:pPr>
+        <w:spacing w:after="0" w:line="240" w:lineRule="auto"/>
+        <w:ind w:left="360"/>
+        <w:rPr>
+          <w:lang w:val="en-US"/>
+        </w:rPr>
+      </w:pPr>
+      <w:r>
+        <w:rPr>
+          <w:lang w:val="en-US"/>
+        </w:rPr>
+        <w:tab/>
+      </w:r>
+      <w:r>
+        <w:rPr>
+          <w:lang w:val="en-US"/>
+        </w:rPr>
+        <w:tab/>
+      </w:r>
+      <w:r>
+        <w:rPr>
+          <w:lang w:val="en-US"/>
+        </w:rPr>
+        <w:t>ssh -T git@github.com</w:t>
+      </w:r>
+    </w:p>
+    <w:p>
+      <w:pPr>
+        <w:spacing w:after="0" w:line="240" w:lineRule="auto"/>
+        <w:ind w:left="360"/>
+        <w:rPr>
+          <w:lang w:val="en-US"/>
+        </w:rPr>
+      </w:pPr>
+    </w:p>
+    <w:p>
+      <w:pPr>
+        <w:spacing w:after="0" w:line="240" w:lineRule="auto"/>
+        <w:rPr>
+          <w:b/>
+          <w:bCs/>
+        </w:rPr>
+      </w:pPr>
+      <w:r>
+        <w:rPr>
+          <w:b/>
+          <w:bCs/>
+        </w:rPr>
         <w:t xml:space="preserve">PARTE 3: Configurar </w:t>
       </w:r>
       <w:proofErr w:type="spellStart"/>
@@ -2995,8 +3440,24 @@
       <w:pPr>
         <w:spacing w:after="0" w:line="240" w:lineRule="auto"/>
         <w:ind w:left="708"/>
-      </w:pPr>
-      <w:r>
+        <w:rPr>
+          <w:b/>
+          <w:bCs/>
+        </w:rPr>
+      </w:pPr>
+      <w:r>
+        <w:rPr>
+          <w:b/>
+          <w:bCs/>
+        </w:rPr>
+        <w:lastRenderedPageBreak/>
+        <w:t xml:space="preserve">2. </w:t>
+      </w:r>
+      <w:r>
+        <w:rPr>
+          <w:b/>
+          <w:bCs/>
+        </w:rPr>
         <w:t>Iniciar:</w:t>
       </w:r>
     </w:p>
@@ -3035,6 +3496,65 @@
         <w:spacing w:after="0" w:line="240" w:lineRule="auto"/>
         <w:ind w:left="708"/>
       </w:pPr>
+      <w:r>
+        <w:t xml:space="preserve">3. </w:t>
+      </w:r>
+    </w:p>
+    <w:p>
+      <w:pPr>
+        <w:spacing w:after="0" w:line="240" w:lineRule="auto"/>
+        <w:ind w:left="708"/>
+        <w:rPr>
+          <w:lang w:val="en-US"/>
+        </w:rPr>
+      </w:pPr>
+      <w:r>
+        <w:tab/>
+      </w:r>
+      <w:r>
+        <w:rPr>
+          <w:lang w:val="en-US"/>
+        </w:rPr>
+        <w:t>git remote set-</w:t>
+      </w:r>
+      <w:proofErr w:type="spellStart"/>
+      <w:r>
+        <w:rPr>
+          <w:lang w:val="en-US"/>
+        </w:rPr>
+        <w:t>url</w:t>
+      </w:r>
+      <w:proofErr w:type="spellEnd"/>
+      <w:r>
+        <w:rPr>
+          <w:lang w:val="en-US"/>
+        </w:rPr>
+        <w:t xml:space="preserve"> origin </w:t>
+      </w:r>
+      <w:proofErr w:type="spellStart"/>
+      <w:proofErr w:type="gramStart"/>
+      <w:r>
+        <w:rPr>
+          <w:lang w:val="en-US"/>
+        </w:rPr>
+        <w:t>git@github.com:jorgehinojosaTecMi</w:t>
+      </w:r>
+      <w:proofErr w:type="spellEnd"/>
+      <w:r>
+        <w:rPr>
+          <w:lang w:val="en-US"/>
+        </w:rPr>
+        <w:t>/mi-</w:t>
+      </w:r>
+      <w:proofErr w:type="spellStart"/>
+      <w:r>
+        <w:rPr>
+          <w:lang w:val="en-US"/>
+        </w:rPr>
+        <w:t>lab.git</w:t>
+      </w:r>
+      <w:proofErr w:type="spellEnd"/>
+      <w:proofErr w:type="gramEnd"/>
     </w:p>
     <w:p>
       <w:pPr>
@@ -3308,15 +3828,22 @@
     <w:p>
       <w:pPr>
         <w:spacing w:after="0" w:line="240" w:lineRule="auto"/>
-        <w:rPr>
-          <w:b/>
-          <w:bCs/>
-        </w:rPr>
-      </w:pPr>
-      <w:r>
-        <w:rPr>
-          <w:b/>
-          <w:bCs/>
+      </w:pPr>
+    </w:p>
+    <w:p>
+      <w:pPr>
+        <w:spacing w:after="0" w:line="240" w:lineRule="auto"/>
+        <w:rPr>
+          <w:b/>
+          <w:bCs/>
+          <w:highlight w:val="yellow"/>
+        </w:rPr>
+      </w:pPr>
+      <w:r>
+        <w:rPr>
+          <w:b/>
+          <w:bCs/>
+          <w:highlight w:val="yellow"/>
         </w:rPr>
         <w:t xml:space="preserve">PARTE 5: Crear </w:t>
       </w:r>
@@ -3325,6 +3852,7 @@
         <w:rPr>
           <w:b/>
           <w:bCs/>
+          <w:highlight w:val="yellow"/>
         </w:rPr>
         <w:t>CodePipeline</w:t>
       </w:r>
@@ -3334,31 +3862,429 @@
       <w:pPr>
         <w:spacing w:after="0" w:line="240" w:lineRule="auto"/>
         <w:ind w:left="708"/>
-      </w:pPr>
-      <w:r>
-        <w:lastRenderedPageBreak/>
+        <w:rPr>
+          <w:highlight w:val="yellow"/>
+        </w:rPr>
+      </w:pPr>
+      <w:r>
+        <w:rPr>
+          <w:highlight w:val="yellow"/>
+        </w:rPr>
         <w:t xml:space="preserve">En AWS </w:t>
       </w:r>
       <w:proofErr w:type="spellStart"/>
       <w:r>
+        <w:rPr>
+          <w:highlight w:val="yellow"/>
+        </w:rPr>
         <w:t>CodePipeline</w:t>
       </w:r>
       <w:proofErr w:type="spellEnd"/>
       <w:r>
+        <w:rPr>
+          <w:highlight w:val="yellow"/>
+        </w:rPr>
         <w:t>:</w:t>
       </w:r>
     </w:p>
     <w:p>
       <w:pPr>
         <w:spacing w:after="0" w:line="240" w:lineRule="auto"/>
+        <w:ind w:left="1416"/>
+        <w:rPr>
+          <w:highlight w:val="yellow"/>
+        </w:rPr>
+      </w:pPr>
+      <w:proofErr w:type="spellStart"/>
+      <w:r>
+        <w:rPr>
+          <w:highlight w:val="yellow"/>
+        </w:rPr>
+        <w:t>Category</w:t>
+      </w:r>
+      <w:proofErr w:type="spellEnd"/>
+      <w:r>
+        <w:rPr>
+          <w:highlight w:val="yellow"/>
+        </w:rPr>
+        <w:t xml:space="preserve"> selecciona </w:t>
+      </w:r>
+      <w:r>
+        <w:rPr>
+          <w:i/>
+          <w:iCs/>
+          <w:highlight w:val="yellow"/>
+        </w:rPr>
+        <w:t>Crear una canalización personalizada</w:t>
+      </w:r>
+    </w:p>
+    <w:p>
+      <w:pPr>
+        <w:spacing w:after="0" w:line="240" w:lineRule="auto"/>
+        <w:rPr>
+          <w:highlight w:val="yellow"/>
+        </w:rPr>
+      </w:pPr>
+      <w:r>
+        <w:rPr>
+          <w:highlight w:val="yellow"/>
+        </w:rPr>
+        <w:drawing>
+          <wp:inline distT="0" distB="0" distL="0" distR="0" wp14:anchorId="3A17B5B6" wp14:editId="5D5C89E7">
+            <wp:extent cx="3814762" cy="1016493"/>
+            <wp:effectExtent l="0" t="0" r="0" b="0"/>
+            <wp:docPr id="888944787" name="Imagen 1" descr="Interfaz de usuario gráfica, Texto, Aplicación&#10;&#10;El contenido generado por IA puede ser incorrecto."/>
+            <wp:cNvGraphicFramePr>
+              <a:graphicFrameLocks xmlns:a="http://schemas.openxmlformats.org/drawingml/2006/main" noChangeAspect="1"/>
+            </wp:cNvGraphicFramePr>
+            <a:graphic xmlns:a="http://schemas.openxmlformats.org/drawingml/2006/main">
+              <a:graphicData uri="http://schemas.openxmlformats.org/drawingml/2006/picture">
+                <pic:pic xmlns:pic="http://schemas.openxmlformats.org/drawingml/2006/picture">
+                  <pic:nvPicPr>
+                    <pic:cNvPr id="888944787" name="Imagen 1" descr="Interfaz de usuario gráfica, Texto, Aplicación&#10;&#10;El contenido generado por IA puede ser incorrecto."/>
+                    <pic:cNvPicPr/>
+                  </pic:nvPicPr>
+                  <pic:blipFill>
+                    <a:blip r:embed="rId5"/>
+                    <a:stretch>
+                      <a:fillRect/>
+                    </a:stretch>
+                  </pic:blipFill>
+                  <pic:spPr>
+                    <a:xfrm>
+                      <a:off x="0" y="0"/>
+                      <a:ext cx="3848197" cy="1025402"/>
+                    </a:xfrm>
+                    <a:prstGeom prst="rect">
+                      <a:avLst/>
+                    </a:prstGeom>
+                  </pic:spPr>
+                </pic:pic>
+              </a:graphicData>
+            </a:graphic>
+          </wp:inline>
+        </w:drawing>
+      </w:r>
+    </w:p>
+    <w:p>
+      <w:pPr>
+        <w:spacing w:after="0" w:line="240" w:lineRule="auto"/>
+        <w:rPr>
+          <w:highlight w:val="yellow"/>
+        </w:rPr>
+      </w:pPr>
+      <w:r>
+        <w:rPr>
+          <w:highlight w:val="yellow"/>
+        </w:rPr>
+        <w:tab/>
+        <w:t xml:space="preserve">Conectar a </w:t>
+      </w:r>
+      <w:proofErr w:type="spellStart"/>
+      <w:r>
+        <w:rPr>
+          <w:highlight w:val="yellow"/>
+        </w:rPr>
+        <w:t>Github</w:t>
+      </w:r>
+      <w:proofErr w:type="spellEnd"/>
+      <w:r>
+        <w:rPr>
+          <w:highlight w:val="yellow"/>
+        </w:rPr>
+        <w:t xml:space="preserve"> &lt;autoriza&gt;</w:t>
+      </w:r>
+    </w:p>
+    <w:p>
+      <w:pPr>
+        <w:spacing w:after="0" w:line="240" w:lineRule="auto"/>
+        <w:rPr>
+          <w:highlight w:val="yellow"/>
+        </w:rPr>
+      </w:pPr>
+      <w:r>
+        <w:rPr>
+          <w:highlight w:val="yellow"/>
+        </w:rPr>
+        <w:tab/>
+        <w:t xml:space="preserve">Selecciona el repositorio </w:t>
+      </w:r>
+    </w:p>
+    <w:p>
+      <w:pPr>
+        <w:spacing w:after="0" w:line="240" w:lineRule="auto"/>
+        <w:rPr>
+          <w:highlight w:val="yellow"/>
+        </w:rPr>
+      </w:pPr>
+      <w:r>
+        <w:rPr>
+          <w:highlight w:val="yellow"/>
+        </w:rPr>
+        <w:tab/>
+        <w:t xml:space="preserve">Ramificación </w:t>
+      </w:r>
+      <w:proofErr w:type="spellStart"/>
+      <w:r>
+        <w:rPr>
+          <w:highlight w:val="yellow"/>
+        </w:rPr>
+        <w:t>main</w:t>
+      </w:r>
+      <w:proofErr w:type="spellEnd"/>
+    </w:p>
+    <w:p>
+      <w:pPr>
+        <w:spacing w:after="0" w:line="240" w:lineRule="auto"/>
+        <w:rPr>
+          <w:highlight w:val="yellow"/>
+        </w:rPr>
+      </w:pPr>
+      <w:r>
+        <w:rPr>
+          <w:highlight w:val="yellow"/>
+        </w:rPr>
+        <w:t>Paso 2</w:t>
+      </w:r>
+    </w:p>
+    <w:p>
+      <w:pPr>
+        <w:spacing w:after="0" w:line="240" w:lineRule="auto"/>
+        <w:rPr>
+          <w:highlight w:val="yellow"/>
+        </w:rPr>
+      </w:pPr>
+      <w:r>
+        <w:rPr>
+          <w:highlight w:val="yellow"/>
+        </w:rPr>
+        <w:tab/>
+      </w:r>
+      <w:r>
+        <w:rPr>
+          <w:highlight w:val="yellow"/>
+        </w:rPr>
+        <w:t>Rol de servicio existente</w:t>
+      </w:r>
+    </w:p>
+    <w:p>
+      <w:pPr>
+        <w:spacing w:after="0" w:line="240" w:lineRule="auto"/>
+        <w:rPr>
+          <w:highlight w:val="yellow"/>
+        </w:rPr>
+      </w:pPr>
+      <w:r>
+        <w:rPr>
+          <w:highlight w:val="yellow"/>
+        </w:rPr>
+        <w:t>Paso 4</w:t>
+      </w:r>
+    </w:p>
+    <w:p>
+      <w:pPr>
+        <w:spacing w:after="0" w:line="240" w:lineRule="auto"/>
+        <w:rPr>
+          <w:highlight w:val="yellow"/>
+        </w:rPr>
+      </w:pPr>
+      <w:r>
+        <w:rPr>
+          <w:b/>
+          <w:bCs/>
+          <w:highlight w:val="yellow"/>
+        </w:rPr>
+        <w:t>Comandos</w:t>
+      </w:r>
+    </w:p>
+    <w:p>
+      <w:pPr>
+        <w:spacing w:after="0" w:line="240" w:lineRule="auto"/>
         <w:ind w:left="708"/>
-      </w:pPr>
+        <w:rPr>
+          <w:highlight w:val="yellow"/>
+        </w:rPr>
+      </w:pPr>
+      <w:r>
+        <w:rPr>
+          <w:highlight w:val="yellow"/>
+        </w:rPr>
+        <w:t>cd /</w:t>
+      </w:r>
+      <w:proofErr w:type="spellStart"/>
+      <w:r>
+        <w:rPr>
+          <w:highlight w:val="yellow"/>
+        </w:rPr>
+        <w:t>var</w:t>
+      </w:r>
+      <w:proofErr w:type="spellEnd"/>
+      <w:r>
+        <w:rPr>
+          <w:highlight w:val="yellow"/>
+        </w:rPr>
+        <w:t>/www/</w:t>
+      </w:r>
+      <w:proofErr w:type="spellStart"/>
+      <w:r>
+        <w:rPr>
+          <w:highlight w:val="yellow"/>
+        </w:rPr>
+        <w:t>html</w:t>
+      </w:r>
+      <w:proofErr w:type="spellEnd"/>
     </w:p>
     <w:p>
       <w:pPr>
         <w:spacing w:after="0" w:line="240" w:lineRule="auto"/>
         <w:ind w:left="708"/>
         <w:rPr>
+          <w:highlight w:val="yellow"/>
+        </w:rPr>
+      </w:pPr>
+      <w:proofErr w:type="spellStart"/>
+      <w:r>
+        <w:rPr>
+          <w:highlight w:val="yellow"/>
+        </w:rPr>
+        <w:t>git</w:t>
+      </w:r>
+      <w:proofErr w:type="spellEnd"/>
+      <w:r>
+        <w:rPr>
+          <w:highlight w:val="yellow"/>
+        </w:rPr>
+        <w:t xml:space="preserve"> clone </w:t>
+      </w:r>
+      <w:proofErr w:type="spellStart"/>
+      <w:proofErr w:type="gramStart"/>
+      <w:r>
+        <w:rPr>
+          <w:highlight w:val="yellow"/>
+        </w:rPr>
+        <w:t>git@github.com:jorgehinojosaTecMi</w:t>
+      </w:r>
+      <w:proofErr w:type="spellEnd"/>
+      <w:r>
+        <w:rPr>
+          <w:highlight w:val="yellow"/>
+        </w:rPr>
+        <w:t>/mi-</w:t>
+      </w:r>
+      <w:proofErr w:type="spellStart"/>
+      <w:r>
+        <w:rPr>
+          <w:highlight w:val="yellow"/>
+        </w:rPr>
+        <w:t>lab.git</w:t>
+      </w:r>
+      <w:proofErr w:type="spellEnd"/>
+      <w:proofErr w:type="gramEnd"/>
+    </w:p>
+    <w:p>
+      <w:pPr>
+        <w:spacing w:after="0" w:line="240" w:lineRule="auto"/>
+        <w:ind w:left="708"/>
+        <w:rPr>
+          <w:highlight w:val="yellow"/>
+          <w:lang w:val="en-US"/>
+        </w:rPr>
+      </w:pPr>
+      <w:r>
+        <w:rPr>
+          <w:highlight w:val="yellow"/>
+          <w:lang w:val="en-US"/>
+        </w:rPr>
+        <w:t>cd mi-lab</w:t>
+      </w:r>
+    </w:p>
+    <w:p>
+      <w:pPr>
+        <w:spacing w:after="0" w:line="240" w:lineRule="auto"/>
+        <w:ind w:left="708"/>
+        <w:rPr>
+          <w:highlight w:val="yellow"/>
+          <w:lang w:val="en-US"/>
+        </w:rPr>
+      </w:pPr>
+      <w:r>
+        <w:rPr>
+          <w:highlight w:val="yellow"/>
+          <w:lang w:val="en-US"/>
+        </w:rPr>
+        <w:t>git pull origin main</w:t>
+      </w:r>
+    </w:p>
+    <w:p>
+      <w:pPr>
+        <w:spacing w:after="0" w:line="240" w:lineRule="auto"/>
+        <w:ind w:left="708"/>
+        <w:rPr>
+          <w:lang w:val="en-US"/>
+        </w:rPr>
+      </w:pPr>
+      <w:r>
+        <w:rPr>
+          <w:highlight w:val="yellow"/>
+          <w:lang w:val="en-US"/>
+        </w:rPr>
+        <w:t xml:space="preserve">cp </w:t>
+      </w:r>
+      <w:proofErr w:type="spellStart"/>
+      <w:r>
+        <w:rPr>
+          <w:highlight w:val="yellow"/>
+          <w:lang w:val="en-US"/>
+        </w:rPr>
+        <w:t>index.php</w:t>
+      </w:r>
+      <w:proofErr w:type="spellEnd"/>
+      <w:r>
+        <w:rPr>
+          <w:highlight w:val="yellow"/>
+          <w:lang w:val="en-US"/>
+        </w:rPr>
+        <w:t xml:space="preserve"> /var/www/html/</w:t>
+      </w:r>
+      <w:proofErr w:type="spellStart"/>
+      <w:r>
+        <w:rPr>
+          <w:highlight w:val="yellow"/>
+          <w:lang w:val="en-US"/>
+        </w:rPr>
+        <w:t>index.php</w:t>
+      </w:r>
+      <w:proofErr w:type="spellEnd"/>
+    </w:p>
+    <w:p>
+      <w:pPr>
+        <w:spacing w:after="0" w:line="240" w:lineRule="auto"/>
+        <w:rPr>
+          <w:lang w:val="en-US"/>
+        </w:rPr>
+      </w:pPr>
+    </w:p>
+    <w:p>
+      <w:pPr>
+        <w:spacing w:after="0" w:line="240" w:lineRule="auto"/>
+        <w:rPr>
+          <w:b/>
+          <w:bCs/>
+        </w:rPr>
+      </w:pPr>
+    </w:p>
+    <w:p>
+      <w:pPr>
+        <w:spacing w:after="0" w:line="240" w:lineRule="auto"/>
+      </w:pPr>
+      <w:r>
+        <w:t>En lugar de pipeline</w:t>
+      </w:r>
+    </w:p>
+    <w:p>
+      <w:pPr>
+        <w:spacing w:after="0" w:line="240" w:lineRule="auto"/>
+        <w:rPr>
           <w:b/>
           <w:bCs/>
         </w:rPr>
@@ -3370,262 +4296,298 @@
         </w:rPr>
         <w:t xml:space="preserve">1. </w:t>
       </w:r>
-      <w:proofErr w:type="spellStart"/>
-      <w:r>
-        <w:rPr>
-          <w:b/>
-          <w:bCs/>
-        </w:rPr>
-        <w:t>Source</w:t>
-      </w:r>
-      <w:proofErr w:type="spellEnd"/>
-    </w:p>
-    <w:p>
-      <w:pPr>
-        <w:numPr>
-          <w:ilvl w:val="0"/>
-          <w:numId w:val="7"/>
-        </w:numPr>
-        <w:tabs>
-          <w:tab w:val="clear" w:pos="720"/>
-          <w:tab w:val="num" w:pos="1428"/>
-        </w:tabs>
-        <w:spacing w:after="0" w:line="240" w:lineRule="auto"/>
-        <w:ind w:left="1428"/>
-      </w:pPr>
-      <w:proofErr w:type="spellStart"/>
-      <w:r>
-        <w:t>Provider</w:t>
-      </w:r>
-      <w:proofErr w:type="spellEnd"/>
-      <w:r>
-        <w:t xml:space="preserve">: GitHub </w:t>
-      </w:r>
-    </w:p>
-    <w:p>
-      <w:pPr>
-        <w:numPr>
-          <w:ilvl w:val="0"/>
-          <w:numId w:val="7"/>
-        </w:numPr>
-        <w:tabs>
-          <w:tab w:val="clear" w:pos="720"/>
-          <w:tab w:val="num" w:pos="1428"/>
-        </w:tabs>
-        <w:spacing w:after="0" w:line="240" w:lineRule="auto"/>
-        <w:ind w:left="1428"/>
-      </w:pPr>
-      <w:r>
-        <w:t xml:space="preserve">Conecta tu cuenta </w:t>
-      </w:r>
-    </w:p>
-    <w:p>
-      <w:pPr>
-        <w:numPr>
-          <w:ilvl w:val="0"/>
-          <w:numId w:val="7"/>
-        </w:numPr>
-        <w:tabs>
-          <w:tab w:val="clear" w:pos="720"/>
-          <w:tab w:val="num" w:pos="1428"/>
-        </w:tabs>
-        <w:spacing w:after="0" w:line="240" w:lineRule="auto"/>
-        <w:ind w:left="1428"/>
-      </w:pPr>
-      <w:r>
-        <w:t xml:space="preserve">Repo + </w:t>
-      </w:r>
-      <w:proofErr w:type="spellStart"/>
-      <w:r>
-        <w:t>branch</w:t>
+      <w:r>
+        <w:rPr>
+          <w:b/>
+          <w:bCs/>
+        </w:rPr>
+        <w:t xml:space="preserve">Git conectado </w:t>
+      </w:r>
+      <w:r>
+        <w:rPr>
+          <w:rFonts w:ascii="Segoe UI Emoji" w:hAnsi="Segoe UI Emoji" w:cs="Segoe UI Emoji"/>
+          <w:b/>
+          <w:bCs/>
+        </w:rPr>
+        <w:t>✔️</w:t>
+      </w:r>
+    </w:p>
+    <w:p>
+      <w:pPr>
+        <w:spacing w:after="0" w:line="240" w:lineRule="auto"/>
+      </w:pPr>
+    </w:p>
+    <w:p>
+      <w:pPr>
+        <w:spacing w:after="0" w:line="240" w:lineRule="auto"/>
+        <w:rPr>
+          <w:b/>
+          <w:bCs/>
+        </w:rPr>
+      </w:pPr>
+      <w:r>
+        <w:rPr>
+          <w:b/>
+          <w:bCs/>
+        </w:rPr>
+        <w:t>2. Script de actualización</w:t>
+      </w:r>
+    </w:p>
+    <w:p>
+      <w:pPr>
+        <w:spacing w:after="0" w:line="240" w:lineRule="auto"/>
+        <w:ind w:firstLine="708"/>
+      </w:pPr>
+      <w:r>
+        <w:t>nano /var/www/html/update.sh</w:t>
+      </w:r>
+    </w:p>
+    <w:p>
+      <w:pPr>
+        <w:spacing w:after="0" w:line="240" w:lineRule="auto"/>
+        <w:rPr>
+          <w:lang w:val="en-US"/>
+        </w:rPr>
+      </w:pPr>
+      <w:r>
+        <w:tab/>
+      </w:r>
+      <w:proofErr w:type="spellStart"/>
+      <w:r>
+        <w:rPr>
+          <w:lang w:val="en-US"/>
+        </w:rPr>
+        <w:t>Contenido</w:t>
+      </w:r>
+      <w:proofErr w:type="spellEnd"/>
+    </w:p>
+    <w:p>
+      <w:pPr>
+        <w:spacing w:after="0" w:line="240" w:lineRule="auto"/>
+        <w:ind w:left="1416"/>
+        <w:rPr>
+          <w:lang w:val="en-US"/>
+        </w:rPr>
+      </w:pPr>
+      <w:proofErr w:type="gramStart"/>
+      <w:r>
+        <w:rPr>
+          <w:lang w:val="en-US"/>
+        </w:rPr>
+        <w:t>#!/</w:t>
+      </w:r>
+      <w:proofErr w:type="gramEnd"/>
+      <w:r>
+        <w:rPr>
+          <w:lang w:val="en-US"/>
+        </w:rPr>
+        <w:t>bin/bash</w:t>
+      </w:r>
+      <w:r>
+        <w:rPr>
+          <w:lang w:val="en-US"/>
+        </w:rPr>
+        <w:br/>
+      </w:r>
+      <w:r>
+        <w:rPr>
+          <w:lang w:val="en-US"/>
+        </w:rPr>
+        <w:br/>
+        <w:t>cd /var/www/html/mi-lab</w:t>
+      </w:r>
+      <w:r>
+        <w:rPr>
+          <w:lang w:val="en-US"/>
+        </w:rPr>
+        <w:br/>
+      </w:r>
+      <w:r>
+        <w:rPr>
+          <w:lang w:val="en-US"/>
+        </w:rPr>
+        <w:br/>
+        <w:t>git pull origin main</w:t>
+      </w:r>
+      <w:r>
+        <w:rPr>
+          <w:lang w:val="en-US"/>
+        </w:rPr>
+        <w:br/>
+      </w:r>
+      <w:r>
+        <w:rPr>
+          <w:lang w:val="en-US"/>
+        </w:rPr>
+        <w:br/>
+        <w:t xml:space="preserve">cp </w:t>
+      </w:r>
+      <w:proofErr w:type="spellStart"/>
+      <w:r>
+        <w:rPr>
+          <w:lang w:val="en-US"/>
+        </w:rPr>
+        <w:t>index.php</w:t>
+      </w:r>
+      <w:proofErr w:type="spellEnd"/>
+      <w:r>
+        <w:rPr>
+          <w:lang w:val="en-US"/>
+        </w:rPr>
+        <w:t xml:space="preserve"> /var/www/html/</w:t>
+      </w:r>
+      <w:proofErr w:type="spellStart"/>
+      <w:r>
+        <w:rPr>
+          <w:lang w:val="en-US"/>
+        </w:rPr>
+        <w:t>index.php</w:t>
+      </w:r>
+      <w:proofErr w:type="spellEnd"/>
+    </w:p>
+    <w:p>
+      <w:pPr>
+        <w:spacing w:after="0" w:line="240" w:lineRule="auto"/>
+        <w:ind w:left="1416"/>
+        <w:rPr>
+          <w:lang w:val="en-US"/>
+        </w:rPr>
+      </w:pPr>
+      <w:proofErr w:type="spellStart"/>
+      <w:r>
+        <w:rPr>
+          <w:lang w:val="en-US"/>
+        </w:rPr>
+        <w:t>chmod</w:t>
+      </w:r>
+      <w:proofErr w:type="spellEnd"/>
+      <w:r>
+        <w:rPr>
+          <w:lang w:val="en-US"/>
+        </w:rPr>
+        <w:t xml:space="preserve"> +x /var/www/html/update.sh</w:t>
+      </w:r>
+    </w:p>
+    <w:p>
+      <w:pPr>
+        <w:spacing w:after="0" w:line="240" w:lineRule="auto"/>
+        <w:rPr>
+          <w:lang w:val="en-US"/>
+        </w:rPr>
+      </w:pPr>
+    </w:p>
+    <w:p>
+      <w:pPr>
+        <w:spacing w:after="0" w:line="240" w:lineRule="auto"/>
+        <w:rPr>
+          <w:b/>
+          <w:bCs/>
+        </w:rPr>
+      </w:pPr>
+      <w:r>
+        <w:rPr>
+          <w:b/>
+          <w:bCs/>
+        </w:rPr>
+        <w:t>3. Automatizar</w:t>
+      </w:r>
+    </w:p>
+    <w:p>
+      <w:pPr>
+        <w:spacing w:after="0" w:line="240" w:lineRule="auto"/>
+        <w:ind w:left="708"/>
+      </w:pPr>
+      <w:proofErr w:type="spellStart"/>
+      <w:r>
+        <w:t>crontab</w:t>
+      </w:r>
+      <w:proofErr w:type="spellEnd"/>
+      <w:r>
+        <w:t xml:space="preserve"> -e</w:t>
+      </w:r>
+    </w:p>
+    <w:p>
+      <w:pPr>
+        <w:spacing w:after="0" w:line="240" w:lineRule="auto"/>
+        <w:ind w:firstLine="708"/>
+      </w:pPr>
+      <w:r>
+        <w:t>contenido</w:t>
+      </w:r>
+    </w:p>
+    <w:p>
+      <w:pPr>
+        <w:spacing w:after="0" w:line="240" w:lineRule="auto"/>
+        <w:ind w:firstLine="708"/>
+      </w:pPr>
+      <w:r>
+        <w:t>* * * * * /var/www/html/update.sh</w:t>
+      </w:r>
+    </w:p>
+    <w:p>
+      <w:pPr>
+        <w:spacing w:after="0" w:line="240" w:lineRule="auto"/>
+        <w:rPr>
+          <w:b/>
+          <w:bCs/>
+        </w:rPr>
+      </w:pPr>
+      <w:r>
+        <w:rPr>
+          <w:b/>
+          <w:bCs/>
+        </w:rPr>
+        <w:t>Resultado</w:t>
+      </w:r>
+    </w:p>
+    <w:p>
+      <w:pPr>
+        <w:spacing w:after="0" w:line="240" w:lineRule="auto"/>
+        <w:rPr>
+          <w:b/>
+          <w:bCs/>
+        </w:rPr>
+      </w:pPr>
+      <w:proofErr w:type="spellStart"/>
+      <w:r>
+        <w:t>git</w:t>
       </w:r>
       <w:proofErr w:type="spellEnd"/>
       <w:r>
         <w:t xml:space="preserve"> </w:t>
       </w:r>
-    </w:p>
-    <w:p>
-      <w:pPr>
-        <w:spacing w:after="0" w:line="240" w:lineRule="auto"/>
-        <w:ind w:left="708"/>
-      </w:pPr>
-    </w:p>
-    <w:p>
-      <w:pPr>
-        <w:spacing w:after="0" w:line="240" w:lineRule="auto"/>
-        <w:ind w:left="708"/>
-        <w:rPr>
-          <w:b/>
-          <w:bCs/>
-        </w:rPr>
-      </w:pPr>
-      <w:r>
-        <w:rPr>
-          <w:b/>
-          <w:bCs/>
-        </w:rPr>
-        <w:t xml:space="preserve">2. </w:t>
-      </w:r>
-      <w:proofErr w:type="spellStart"/>
-      <w:r>
-        <w:rPr>
-          <w:b/>
-          <w:bCs/>
-        </w:rPr>
-        <w:t>Build</w:t>
-      </w:r>
-      <w:proofErr w:type="spellEnd"/>
-      <w:r>
-        <w:rPr>
-          <w:b/>
-          <w:bCs/>
-        </w:rPr>
-        <w:t xml:space="preserve"> (opcional)</w:t>
-      </w:r>
-    </w:p>
-    <w:p>
-      <w:pPr>
-        <w:spacing w:after="0" w:line="240" w:lineRule="auto"/>
-        <w:ind w:left="708" w:firstLine="708"/>
-      </w:pPr>
-      <w:r>
-        <w:t xml:space="preserve">Puedes omitir (para este </w:t>
-      </w:r>
-      <w:proofErr w:type="spellStart"/>
-      <w:r>
-        <w:t>lab</w:t>
-      </w:r>
-      <w:proofErr w:type="spellEnd"/>
-      <w:r>
-        <w:t>)</w:t>
-      </w:r>
-    </w:p>
-    <w:p>
-      <w:pPr>
-        <w:spacing w:after="0" w:line="240" w:lineRule="auto"/>
-        <w:ind w:left="708"/>
-      </w:pPr>
-    </w:p>
-    <w:p>
-      <w:pPr>
-        <w:spacing w:after="0" w:line="240" w:lineRule="auto"/>
-        <w:ind w:left="708"/>
-        <w:rPr>
-          <w:b/>
-          <w:bCs/>
-        </w:rPr>
-      </w:pPr>
-      <w:r>
-        <w:rPr>
-          <w:b/>
-          <w:bCs/>
-        </w:rPr>
-        <w:t xml:space="preserve">3. </w:t>
-      </w:r>
-      <w:proofErr w:type="spellStart"/>
-      <w:r>
-        <w:rPr>
-          <w:b/>
-          <w:bCs/>
-        </w:rPr>
-        <w:t>Deploy</w:t>
-      </w:r>
-      <w:proofErr w:type="spellEnd"/>
-    </w:p>
-    <w:p>
-      <w:pPr>
-        <w:numPr>
-          <w:ilvl w:val="0"/>
-          <w:numId w:val="8"/>
-        </w:numPr>
-        <w:tabs>
-          <w:tab w:val="clear" w:pos="720"/>
-          <w:tab w:val="num" w:pos="1428"/>
-        </w:tabs>
-        <w:spacing w:after="0" w:line="240" w:lineRule="auto"/>
-        <w:ind w:left="1428"/>
-      </w:pPr>
-      <w:proofErr w:type="spellStart"/>
-      <w:r>
-        <w:t>Provider</w:t>
-      </w:r>
-      <w:proofErr w:type="spellEnd"/>
-      <w:r>
-        <w:t xml:space="preserve">: </w:t>
-      </w:r>
-      <w:proofErr w:type="spellStart"/>
-      <w:r>
-        <w:t>CodeDeploy</w:t>
-      </w:r>
-      <w:proofErr w:type="spellEnd"/>
-      <w:r>
-        <w:t xml:space="preserve"> </w:t>
-      </w:r>
-    </w:p>
-    <w:p>
-      <w:pPr>
-        <w:numPr>
-          <w:ilvl w:val="0"/>
-          <w:numId w:val="8"/>
-        </w:numPr>
-        <w:tabs>
-          <w:tab w:val="clear" w:pos="720"/>
-          <w:tab w:val="num" w:pos="1428"/>
-        </w:tabs>
-        <w:spacing w:after="0" w:line="240" w:lineRule="auto"/>
-        <w:ind w:left="1428"/>
-      </w:pPr>
-      <w:r>
-        <w:t xml:space="preserve">Selecciona: </w:t>
-      </w:r>
-    </w:p>
-    <w:p>
-      <w:pPr>
-        <w:numPr>
-          <w:ilvl w:val="1"/>
-          <w:numId w:val="8"/>
-        </w:numPr>
-        <w:tabs>
-          <w:tab w:val="clear" w:pos="1440"/>
-          <w:tab w:val="num" w:pos="2148"/>
-        </w:tabs>
-        <w:spacing w:after="0" w:line="240" w:lineRule="auto"/>
-        <w:ind w:left="2148"/>
-      </w:pPr>
-      <w:proofErr w:type="spellStart"/>
-      <w:r>
-        <w:t>Application</w:t>
-      </w:r>
-      <w:proofErr w:type="spellEnd"/>
-      <w:r>
-        <w:t xml:space="preserve"> </w:t>
-      </w:r>
-    </w:p>
-    <w:p>
-      <w:pPr>
-        <w:numPr>
-          <w:ilvl w:val="1"/>
-          <w:numId w:val="8"/>
-        </w:numPr>
-        <w:tabs>
-          <w:tab w:val="clear" w:pos="1440"/>
-          <w:tab w:val="num" w:pos="2148"/>
-        </w:tabs>
-        <w:spacing w:after="0" w:line="240" w:lineRule="auto"/>
-        <w:ind w:left="2148"/>
-      </w:pPr>
-      <w:proofErr w:type="spellStart"/>
-      <w:r>
-        <w:t>Deployment</w:t>
-      </w:r>
-      <w:proofErr w:type="spellEnd"/>
-      <w:r>
-        <w:t xml:space="preserve"> Group </w:t>
-      </w:r>
-    </w:p>
-    <w:p>
-      <w:pPr>
-        <w:spacing w:after="0" w:line="240" w:lineRule="auto"/>
+      <w:proofErr w:type="spellStart"/>
+      <w:r>
+        <w:t>push</w:t>
+      </w:r>
+      <w:proofErr w:type="spellEnd"/>
+      <w:r>
+        <w:t xml:space="preserve"> → EC2 hace </w:t>
+      </w:r>
+      <w:proofErr w:type="spellStart"/>
+      <w:r>
+        <w:t>pull</w:t>
+      </w:r>
+      <w:proofErr w:type="spellEnd"/>
+      <w:r>
+        <w:t xml:space="preserve"> → </w:t>
+      </w:r>
+      <w:proofErr w:type="spellStart"/>
+      <w:r>
+        <w:t>index.php</w:t>
+      </w:r>
+      <w:proofErr w:type="spellEnd"/>
+      <w:r>
+        <w:t xml:space="preserve"> se actualiza</w:t>
+      </w:r>
+    </w:p>
+    <w:p>
+      <w:pPr>
+        <w:spacing w:after="0" w:line="240" w:lineRule="auto"/>
+        <w:rPr>
+          <w:b/>
+          <w:bCs/>
+        </w:rPr>
       </w:pPr>
     </w:p>
     <w:p>
@@ -3802,7 +4764,7 @@
         <w:ind w:left="720" w:hanging="360"/>
       </w:pPr>
     </w:lvl>
-    <w:lvl w:ilvl="1" w:tentative="1">
+    <w:lvl w:ilvl="1">
       <w:start w:val="1"/>
       <w:numFmt w:val="decimal"/>
       <w:lvlText w:val="%2."/>
@@ -3900,6 +4862,119 @@
     </w:lvl>
   </w:abstractNum>
   <w:abstractNum w:abstractNumId="1" w15:restartNumberingAfterBreak="0">
+    <w:nsid w:val="1BF1273B"/>
+    <w:multiLevelType w:val="multilevel"/>
+    <w:tmpl w:val="671AE55C"/>
+    <w:lvl w:ilvl="0">
+      <w:start w:val="1"/>
+      <w:numFmt w:val="decimal"/>
+      <w:lvlText w:val="%1."/>
+      <w:lvlJc w:val="left"/>
+      <w:pPr>
+        <w:tabs>
+          <w:tab w:val="num" w:pos="720"/>
+        </w:tabs>
+        <w:ind w:left="720" w:hanging="360"/>
+      </w:pPr>
+    </w:lvl>
+    <w:lvl w:ilvl="1" w:tentative="1">
+      <w:start w:val="1"/>
+      <w:numFmt w:val="decimal"/>
+      <w:lvlText w:val="%2."/>
+      <w:lvlJc w:val="left"/>
+      <w:pPr>
+        <w:tabs>
+          <w:tab w:val="num" w:pos="1440"/>
+        </w:tabs>
+        <w:ind w:left="1440" w:hanging="360"/>
+      </w:pPr>
+    </w:lvl>
+    <w:lvl w:ilvl="2" w:tentative="1">
+      <w:start w:val="1"/>
+      <w:numFmt w:val="decimal"/>
+      <w:lvlText w:val="%3."/>
+      <w:lvlJc w:val="left"/>
+      <w:pPr>
+        <w:tabs>
+          <w:tab w:val="num" w:pos="2160"/>
+        </w:tabs>
+        <w:ind w:left="2160" w:hanging="360"/>
+      </w:pPr>
+    </w:lvl>
+    <w:lvl w:ilvl="3" w:tentative="1">
+      <w:start w:val="1"/>
+      <w:numFmt w:val="decimal"/>
+      <w:lvlText w:val="%4."/>
+      <w:lvlJc w:val="left"/>
+      <w:pPr>
+        <w:tabs>
+          <w:tab w:val="num" w:pos="2880"/>
+        </w:tabs>
+        <w:ind w:left="2880" w:hanging="360"/>
+      </w:pPr>
+    </w:lvl>
+    <w:lvl w:ilvl="4" w:tentative="1">
+      <w:start w:val="1"/>
+      <w:numFmt w:val="decimal"/>
+      <w:lvlText w:val="%5."/>
+      <w:lvlJc w:val="left"/>
+      <w:pPr>
+        <w:tabs>
+          <w:tab w:val="num" w:pos="3600"/>
+        </w:tabs>
+        <w:ind w:left="3600" w:hanging="360"/>
+      </w:pPr>
+    </w:lvl>
+    <w:lvl w:ilvl="5" w:tentative="1">
+      <w:start w:val="1"/>
+      <w:numFmt w:val="decimal"/>
+      <w:lvlText w:val="%6."/>
+      <w:lvlJc w:val="left"/>
+      <w:pPr>
+        <w:tabs>
+          <w:tab w:val="num" w:pos="4320"/>
+        </w:tabs>
+        <w:ind w:left="4320" w:hanging="360"/>
+      </w:pPr>
+    </w:lvl>
+    <w:lvl w:ilvl="6" w:tentative="1">
+      <w:start w:val="1"/>
+      <w:numFmt w:val="decimal"/>
+      <w:lvlText w:val="%7."/>
+      <w:lvlJc w:val="left"/>
+      <w:pPr>
+        <w:tabs>
+          <w:tab w:val="num" w:pos="5040"/>
+        </w:tabs>
+        <w:ind w:left="5040" w:hanging="360"/>
+      </w:pPr>
+    </w:lvl>
+    <w:lvl w:ilvl="7" w:tentative="1">
+      <w:start w:val="1"/>
+      <w:numFmt w:val="decimal"/>
+      <w:lvlText w:val="%8."/>
+      <w:lvlJc w:val="left"/>
+      <w:pPr>
+        <w:tabs>
+          <w:tab w:val="num" w:pos="5760"/>
+        </w:tabs>
+        <w:ind w:left="5760" w:hanging="360"/>
+      </w:pPr>
+    </w:lvl>
+    <w:lvl w:ilvl="8" w:tentative="1">
+      <w:start w:val="1"/>
+      <w:numFmt w:val="decimal"/>
+      <w:lvlText w:val="%9."/>
+      <w:lvlJc w:val="left"/>
+      <w:pPr>
+        <w:tabs>
+          <w:tab w:val="num" w:pos="6480"/>
+        </w:tabs>
+        <w:ind w:left="6480" w:hanging="360"/>
+      </w:pPr>
+    </w:lvl>
+  </w:abstractNum>
+  <w:abstractNum w:abstractNumId="2" w15:restartNumberingAfterBreak="0">
     <w:nsid w:val="25793A8C"/>
     <w:multiLevelType w:val="multilevel"/>
     <w:tmpl w:val="AB44F7C6"/>
@@ -4012,7 +5087,124 @@
       </w:pPr>
     </w:lvl>
   </w:abstractNum>
-  <w:abstractNum w:abstractNumId="2" w15:restartNumberingAfterBreak="0">
+  <w:abstractNum w:abstractNumId="3" w15:restartNumberingAfterBreak="0">
+    <w:nsid w:val="35217F7E"/>
+    <w:multiLevelType w:val="multilevel"/>
+    <w:tmpl w:val="BD0CF3A8"/>
+    <w:lvl w:ilvl="0">
+      <w:start w:val="1"/>
+      <w:numFmt w:val="decimal"/>
+      <w:lvlText w:val="%1."/>
+      <w:lvlJc w:val="left"/>
+      <w:pPr>
+        <w:tabs>
+          <w:tab w:val="num" w:pos="720"/>
+        </w:tabs>
+        <w:ind w:left="720" w:hanging="360"/>
+      </w:pPr>
+    </w:lvl>
+    <w:lvl w:ilvl="1">
+      <w:start w:val="1"/>
+      <w:numFmt w:val="bullet"/>
+      <w:lvlText w:val="o"/>
+      <w:lvlJc w:val="left"/>
+      <w:pPr>
+        <w:tabs>
+          <w:tab w:val="num" w:pos="1440"/>
+        </w:tabs>
+        <w:ind w:left="1440" w:hanging="360"/>
+      </w:pPr>
+      <w:rPr>
+        <w:rFonts w:ascii="Courier New" w:hAnsi="Courier New" w:hint="default"/>
+        <w:sz w:val="20"/>
+      </w:rPr>
+    </w:lvl>
+    <w:lvl w:ilvl="2" w:tentative="1">
+      <w:start w:val="1"/>
+      <w:numFmt w:val="decimal"/>
+      <w:lvlText w:val="%3."/>
+      <w:lvlJc w:val="left"/>
+      <w:pPr>
+        <w:tabs>
+          <w:tab w:val="num" w:pos="2160"/>
+        </w:tabs>
+        <w:ind w:left="2160" w:hanging="360"/>
+      </w:pPr>
+    </w:lvl>
+    <w:lvl w:ilvl="3" w:tentative="1">
+      <w:start w:val="1"/>
+      <w:numFmt w:val="decimal"/>
+      <w:lvlText w:val="%4."/>
+      <w:lvlJc w:val="left"/>
+      <w:pPr>
+        <w:tabs>
+          <w:tab w:val="num" w:pos="2880"/>
+        </w:tabs>
+        <w:ind w:left="2880" w:hanging="360"/>
+      </w:pPr>
+    </w:lvl>
+    <w:lvl w:ilvl="4" w:tentative="1">
+      <w:start w:val="1"/>
+      <w:numFmt w:val="decimal"/>
+      <w:lvlText w:val="%5."/>
+      <w:lvlJc w:val="left"/>
+      <w:pPr>
+        <w:tabs>
+          <w:tab w:val="num" w:pos="3600"/>
+        </w:tabs>
+        <w:ind w:left="3600" w:hanging="360"/>
+      </w:pPr>
+    </w:lvl>
+    <w:lvl w:ilvl="5" w:tentative="1">
+      <w:start w:val="1"/>
+      <w:numFmt w:val="decimal"/>
+      <w:lvlText w:val="%6."/>
+      <w:lvlJc w:val="left"/>
+      <w:pPr>
+        <w:tabs>
+          <w:tab w:val="num" w:pos="4320"/>
+        </w:tabs>
+        <w:ind w:left="4320" w:hanging="360"/>
+      </w:pPr>
+    </w:lvl>
+    <w:lvl w:ilvl="6" w:tentative="1">
+      <w:start w:val="1"/>
+      <w:numFmt w:val="decimal"/>
+      <w:lvlText w:val="%7."/>
+      <w:lvlJc w:val="left"/>
+      <w:pPr>
+        <w:tabs>
+          <w:tab w:val="num" w:pos="5040"/>
+        </w:tabs>
+        <w:ind w:left="5040" w:hanging="360"/>
+      </w:pPr>
+    </w:lvl>
+    <w:lvl w:ilvl="7" w:tentative="1">
+      <w:start w:val="1"/>
+      <w:numFmt w:val="decimal"/>
+      <w:lvlText w:val="%8."/>
+      <w:lvlJc w:val="left"/>
+      <w:pPr>
+        <w:tabs>
+          <w:tab w:val="num" w:pos="5760"/>
+        </w:tabs>
+        <w:ind w:left="5760" w:hanging="360"/>
+      </w:pPr>
+    </w:lvl>
+    <w:lvl w:ilvl="8" w:tentative="1">
+      <w:start w:val="1"/>
+      <w:numFmt w:val="decimal"/>
+      <w:lvlText w:val="%9."/>
+      <w:lvlJc w:val="left"/>
+      <w:pPr>
+        <w:tabs>
+          <w:tab w:val="num" w:pos="6480"/>
+        </w:tabs>
+        <w:ind w:left="6480" w:hanging="360"/>
+      </w:pPr>
+    </w:lvl>
+  </w:abstractNum>
+  <w:abstractNum w:abstractNumId="4" w15:restartNumberingAfterBreak="0">
     <w:nsid w:val="35250C94"/>
     <w:multiLevelType w:val="multilevel"/>
     <w:tmpl w:val="92AE82E0"/>
@@ -4161,7 +5353,7 @@
       </w:rPr>
     </w:lvl>
   </w:abstractNum>
-  <w:abstractNum w:abstractNumId="3" w15:restartNumberingAfterBreak="0">
+  <w:abstractNum w:abstractNumId="5" w15:restartNumberingAfterBreak="0">
     <w:nsid w:val="3E904CA4"/>
     <w:multiLevelType w:val="multilevel"/>
     <w:tmpl w:val="F7E233F0"/>
@@ -4278,7 +5470,7 @@
       </w:pPr>
     </w:lvl>
   </w:abstractNum>
-  <w:abstractNum w:abstractNumId="4" w15:restartNumberingAfterBreak="0">
+  <w:abstractNum w:abstractNumId="6" w15:restartNumberingAfterBreak="0">
     <w:nsid w:val="50B62BA0"/>
     <w:multiLevelType w:val="multilevel"/>
     <w:tmpl w:val="9CF2922A"/>
@@ -4395,7 +5587,7 @@
       </w:pPr>
     </w:lvl>
   </w:abstractNum>
-  <w:abstractNum w:abstractNumId="5" w15:restartNumberingAfterBreak="0">
+  <w:abstractNum w:abstractNumId="7" w15:restartNumberingAfterBreak="0">
     <w:nsid w:val="53E83797"/>
     <w:multiLevelType w:val="multilevel"/>
     <w:tmpl w:val="B51C8F88"/>
@@ -4544,7 +5736,7 @@
       </w:rPr>
     </w:lvl>
   </w:abstractNum>
-  <w:abstractNum w:abstractNumId="6" w15:restartNumberingAfterBreak="0">
+  <w:abstractNum w:abstractNumId="8" w15:restartNumberingAfterBreak="0">
     <w:nsid w:val="5D137DBF"/>
     <w:multiLevelType w:val="multilevel"/>
     <w:tmpl w:val="B3205C9A"/>
@@ -4693,7 +5885,7 @@
       </w:rPr>
     </w:lvl>
   </w:abstractNum>
-  <w:abstractNum w:abstractNumId="7" w15:restartNumberingAfterBreak="0">
+  <w:abstractNum w:abstractNumId="9" w15:restartNumberingAfterBreak="0">
     <w:nsid w:val="62DF3DDD"/>
     <w:multiLevelType w:val="multilevel"/>
     <w:tmpl w:val="EEE4609E"/>
@@ -4842,7 +6034,7 @@
       </w:rPr>
     </w:lvl>
   </w:abstractNum>
-  <w:abstractNum w:abstractNumId="8" w15:restartNumberingAfterBreak="0">
+  <w:abstractNum w:abstractNumId="10" w15:restartNumberingAfterBreak="0">
     <w:nsid w:val="6769677F"/>
     <w:multiLevelType w:val="multilevel"/>
     <w:tmpl w:val="8A12437A"/>
@@ -4991,7 +6183,7 @@
       </w:rPr>
     </w:lvl>
   </w:abstractNum>
-  <w:abstractNum w:abstractNumId="9" w15:restartNumberingAfterBreak="0">
+  <w:abstractNum w:abstractNumId="11" w15:restartNumberingAfterBreak="0">
     <w:nsid w:val="677B288B"/>
     <w:multiLevelType w:val="multilevel"/>
     <w:tmpl w:val="2E7EEF4C"/>
@@ -5140,7 +6332,7 @@
       </w:rPr>
     </w:lvl>
   </w:abstractNum>
-  <w:abstractNum w:abstractNumId="10" w15:restartNumberingAfterBreak="0">
+  <w:abstractNum w:abstractNumId="12" w15:restartNumberingAfterBreak="0">
     <w:nsid w:val="72FB52CF"/>
     <w:multiLevelType w:val="hybridMultilevel"/>
     <w:tmpl w:val="3094F3B8"/>
@@ -5253,7 +6445,7 @@
       </w:rPr>
     </w:lvl>
   </w:abstractNum>
-  <w:abstractNum w:abstractNumId="11" w15:restartNumberingAfterBreak="0">
+  <w:abstractNum w:abstractNumId="13" w15:restartNumberingAfterBreak="0">
     <w:nsid w:val="75691C8C"/>
     <w:multiLevelType w:val="multilevel"/>
     <w:tmpl w:val="A7BC874E"/>
@@ -5366,7 +6558,7 @@
       </w:pPr>
     </w:lvl>
   </w:abstractNum>
-  <w:abstractNum w:abstractNumId="12" w15:restartNumberingAfterBreak="0">
+  <w:abstractNum w:abstractNumId="14" w15:restartNumberingAfterBreak="0">
     <w:nsid w:val="758C4C3E"/>
     <w:multiLevelType w:val="multilevel"/>
     <w:tmpl w:val="50CE3FF4"/>
@@ -5479,7 +6671,7 @@
       </w:pPr>
     </w:lvl>
   </w:abstractNum>
-  <w:abstractNum w:abstractNumId="13" w15:restartNumberingAfterBreak="0">
+  <w:abstractNum w:abstractNumId="15" w15:restartNumberingAfterBreak="0">
     <w:nsid w:val="7C4E1918"/>
     <w:multiLevelType w:val="multilevel"/>
     <w:tmpl w:val="A7BC874E"/>
@@ -5592,7 +6784,7 @@
       </w:pPr>
     </w:lvl>
   </w:abstractNum>
-  <w:abstractNum w:abstractNumId="14" w15:restartNumberingAfterBreak="0">
+  <w:abstractNum w:abstractNumId="16" w15:restartNumberingAfterBreak="0">
     <w:nsid w:val="7CB511DD"/>
     <w:multiLevelType w:val="multilevel"/>
     <w:tmpl w:val="A7BC874E"/>
@@ -5706,49 +6898,55 @@
     </w:lvl>
   </w:abstractNum>
   <w:num w:numId="1" w16cid:durableId="1024289231">
-    <w:abstractNumId w:val="10"/>
+    <w:abstractNumId w:val="12"/>
   </w:num>
   <w:num w:numId="2" w16cid:durableId="1775246282">
     <w:abstractNumId w:val="0"/>
   </w:num>
   <w:num w:numId="3" w16cid:durableId="1918977157">
-    <w:abstractNumId w:val="3"/>
+    <w:abstractNumId w:val="5"/>
   </w:num>
   <w:num w:numId="4" w16cid:durableId="1979458892">
+    <w:abstractNumId w:val="11"/>
+  </w:num>
+  <w:num w:numId="5" w16cid:durableId="888617118">
+    <w:abstractNumId w:val="4"/>
+  </w:num>
+  <w:num w:numId="6" w16cid:durableId="1751077708">
+    <w:abstractNumId w:val="6"/>
+  </w:num>
+  <w:num w:numId="7" w16cid:durableId="2033678549">
     <w:abstractNumId w:val="9"/>
   </w:num>
-  <w:num w:numId="5" w16cid:durableId="888617118">
+  <w:num w:numId="8" w16cid:durableId="2145192243">
+    <w:abstractNumId w:val="8"/>
+  </w:num>
+  <w:num w:numId="9" w16cid:durableId="311299458">
     <w:abstractNumId w:val="2"/>
   </w:num>
-  <w:num w:numId="6" w16cid:durableId="1751077708">
-    <w:abstractNumId w:val="4"/>
+  <w:num w:numId="10" w16cid:durableId="1817456234">
+    <w:abstractNumId w:val="14"/>
   </w:num>
-  <w:num w:numId="7" w16cid:durableId="2033678549">
+  <w:num w:numId="11" w16cid:durableId="1888562064">
     <w:abstractNumId w:val="7"/>
   </w:num>
-  <w:num w:numId="8" w16cid:durableId="2145192243">
-    <w:abstractNumId w:val="6"/>
+  <w:num w:numId="12" w16cid:durableId="662970194">
+    <w:abstractNumId w:val="13"/>
   </w:num>
-  <w:num w:numId="9" w16cid:durableId="311299458">
+  <w:num w:numId="13" w16cid:durableId="211769367">
+    <w:abstractNumId w:val="10"/>
+  </w:num>
+  <w:num w:numId="14" w16cid:durableId="1811241891">
+    <w:abstractNumId w:val="16"/>
+  </w:num>
+  <w:num w:numId="15" w16cid:durableId="98524953">
+    <w:abstractNumId w:val="15"/>
+  </w:num>
+  <w:num w:numId="16" w16cid:durableId="1023169065">
     <w:abstractNumId w:val="1"/>
   </w:num>
-  <w:num w:numId="10" w16cid:durableId="1817456234">
-    <w:abstractNumId w:val="12"/>
-  </w:num>
-  <w:num w:numId="11" w16cid:durableId="1888562064">
-    <w:abstractNumId w:val="5"/>
-  </w:num>
-  <w:num w:numId="12" w16cid:durableId="662970194">
-    <w:abstractNumId w:val="11"/>
-  </w:num>
-  <w:num w:numId="13" w16cid:durableId="211769367">
-    <w:abstractNumId w:val="8"/>
-  </w:num>
-  <w:num w:numId="14" w16cid:durableId="1811241891">
-    <w:abstractNumId w:val="14"/>
-  </w:num>
-  <w:num w:numId="15" w16cid:durableId="98524953">
-    <w:abstractNumId w:val="13"/>
+  <w:num w:numId="17" w16cid:durableId="510754564">
+    <w:abstractNumId w:val="3"/>
   </w:num>
 </w:numbering>
 </file>
@@ -6357,7 +7555,6 @@
   <w:style w:type="character" w:default="1" w:styleId="Fuentedeprrafopredeter">
     <w:name w:val="Default Paragraph Font"/>
     <w:uiPriority w:val="1"/>
-    <w:semiHidden/>
     <w:unhideWhenUsed/>
   </w:style>
   <w:style w:type="table" w:default="1" w:styleId="Tablanormal">
@@ -6669,6 +7866,29 @@
       <w:smallCaps/>
       <w:color w:val="0F4761" w:themeColor="accent1" w:themeShade="BF"/>
       <w:spacing w:val="5"/>
+    </w:rPr>
+  </w:style>
+  <w:style w:type="character" w:styleId="Hipervnculo">
+    <w:name w:val="Hyperlink"/>
+    <w:basedOn w:val="Fuentedeprrafopredeter"/>
+    <w:uiPriority w:val="99"/>
+    <w:unhideWhenUsed/>
+    <w:rsid w:val="00340857"/>
+    <w:rPr>
+      <w:color w:val="467886" w:themeColor="hyperlink"/>
+      <w:u w:val="single"/>
+    </w:rPr>
+  </w:style>
+  <w:style w:type="character" w:styleId="Mencinsinresolver">
+    <w:name w:val="Unresolved Mention"/>
+    <w:basedOn w:val="Fuentedeprrafopredeter"/>
+    <w:uiPriority w:val="99"/>
+    <w:semiHidden/>
+    <w:unhideWhenUsed/>
+    <w:rsid w:val="00340857"/>
+    <w:rPr>
+      <w:color w:val="605E5C"/>
+      <w:shd w:val="clear" w:color="auto" w:fill="E1DFDD"/>
     </w:rPr>
   </w:style>
 </w:styles>

</xml_diff>